<commit_message>
docs: actualizar backlog v1.1, CLAUDE.md, AGENTS.md, README.md y casos de uso (Q3 2026)
</commit_message>
<xml_diff>
--- a/docs/documentacion_oficial/09_Backlog_Producto_Custodio_RAT_Manager_v1.1.docx
+++ b/docs/documentacion_oficial/09_Backlog_Producto_Custodio_RAT_Manager_v1.1.docx
@@ -456,6 +456,48 @@
           </w:p>
         </w:tc>
       </w:tr>
+      <w:tr>
+        <w:tc>
+          <w:tcPr>
+            <w:tcW w:type="dxa" w:w="2493"/>
+          </w:tcPr>
+          <w:p>
+            <w:r>
+              <w:t>1.2</w:t>
+            </w:r>
+          </w:p>
+        </w:tc>
+        <w:tc>
+          <w:tcPr>
+            <w:tcW w:type="dxa" w:w="2493"/>
+          </w:tcPr>
+          <w:p>
+            <w:r>
+              <w:t>Junio 2026</w:t>
+            </w:r>
+          </w:p>
+        </w:tc>
+        <w:tc>
+          <w:tcPr>
+            <w:tcW w:type="dxa" w:w="2493"/>
+          </w:tcPr>
+          <w:p>
+            <w:r>
+              <w:t>Equipo de Desarrollo — Custodio</w:t>
+            </w:r>
+          </w:p>
+        </w:tc>
+        <w:tc>
+          <w:tcPr>
+            <w:tcW w:type="dxa" w:w="2493"/>
+          </w:tcPr>
+          <w:p>
+            <w:r>
+              <w:t>Q3 2026 completado: V1-03, V1-04, V1-06, V1-07, V1-15, V1-20. V1-11 marcado como Completada (con side effects pendientes).</w:t>
+            </w:r>
+          </w:p>
+        </w:tc>
+      </w:tr>
     </w:tbl>
     <w:p/>
     <w:p>
@@ -3302,7 +3344,11 @@
           <w:tcPr>
             <w:tcW w:type="dxa" w:w="1304"/>
           </w:tcPr>
-          <w:p/>
+          <w:p>
+            <w:r>
+              <w:t>Completada</w:t>
+            </w:r>
+          </w:p>
         </w:tc>
       </w:tr>
       <w:tr>
@@ -3371,7 +3417,11 @@
           <w:tcPr>
             <w:tcW w:type="dxa" w:w="1304"/>
           </w:tcPr>
-          <w:p/>
+          <w:p>
+            <w:r>
+              <w:t>Completada</w:t>
+            </w:r>
+          </w:p>
         </w:tc>
       </w:tr>
       <w:tr>
@@ -3509,7 +3559,11 @@
           <w:tcPr>
             <w:tcW w:type="dxa" w:w="1304"/>
           </w:tcPr>
-          <w:p/>
+          <w:p>
+            <w:r>
+              <w:t>Completada</w:t>
+            </w:r>
+          </w:p>
         </w:tc>
       </w:tr>
       <w:tr>
@@ -3578,7 +3632,11 @@
           <w:tcPr>
             <w:tcW w:type="dxa" w:w="1304"/>
           </w:tcPr>
-          <w:p/>
+          <w:p>
+            <w:r>
+              <w:t>Completada</w:t>
+            </w:r>
+          </w:p>
         </w:tc>
       </w:tr>
       <w:tr>
@@ -3854,7 +3912,11 @@
           <w:tcPr>
             <w:tcW w:type="dxa" w:w="1304"/>
           </w:tcPr>
-          <w:p/>
+          <w:p>
+            <w:r>
+              <w:t>Completada</w:t>
+            </w:r>
+          </w:p>
         </w:tc>
       </w:tr>
       <w:tr>
@@ -4130,7 +4192,11 @@
           <w:tcPr>
             <w:tcW w:type="dxa" w:w="1304"/>
           </w:tcPr>
-          <w:p/>
+          <w:p>
+            <w:r>
+              <w:t>Completada</w:t>
+            </w:r>
+          </w:p>
         </w:tc>
       </w:tr>
       <w:tr>
@@ -4475,7 +4541,11 @@
           <w:tcPr>
             <w:tcW w:type="dxa" w:w="1304"/>
           </w:tcPr>
-          <w:p/>
+          <w:p>
+            <w:r>
+              <w:t>Completada</w:t>
+            </w:r>
+          </w:p>
         </w:tc>
       </w:tr>
     </w:tbl>

</xml_diff>

<commit_message>
fix(docs): corregir formato de celdas en backlog v1.1 (size10pt consistente)
</commit_message>
<xml_diff>
--- a/docs/documentacion_oficial/09_Backlog_Producto_Custodio_RAT_Manager_v1.1.docx
+++ b/docs/documentacion_oficial/09_Backlog_Producto_Custodio_RAT_Manager_v1.1.docx
@@ -462,7 +462,11 @@
             <w:tcW w:type="dxa" w:w="2493"/>
           </w:tcPr>
           <w:p>
-            <w:r>
+            <w:pPr/>
+            <w:r>
+              <w:rPr>
+                <w:sz w:val="20"/>
+              </w:rPr>
               <w:t>1.2</w:t>
             </w:r>
           </w:p>
@@ -472,7 +476,11 @@
             <w:tcW w:type="dxa" w:w="2493"/>
           </w:tcPr>
           <w:p>
-            <w:r>
+            <w:pPr/>
+            <w:r>
+              <w:rPr>
+                <w:sz w:val="20"/>
+              </w:rPr>
               <w:t>Junio 2026</w:t>
             </w:r>
           </w:p>
@@ -482,7 +490,11 @@
             <w:tcW w:type="dxa" w:w="2493"/>
           </w:tcPr>
           <w:p>
-            <w:r>
+            <w:pPr/>
+            <w:r>
+              <w:rPr>
+                <w:sz w:val="20"/>
+              </w:rPr>
               <w:t>Equipo de Desarrollo — Custodio</w:t>
             </w:r>
           </w:p>
@@ -492,8 +504,12 @@
             <w:tcW w:type="dxa" w:w="2493"/>
           </w:tcPr>
           <w:p>
-            <w:r>
-              <w:t>Q3 2026 completado: V1-03, V1-04, V1-06, V1-07, V1-15, V1-20. V1-11 marcado como Completada (con side effects pendientes).</w:t>
+            <w:pPr/>
+            <w:r>
+              <w:rPr>
+                <w:sz w:val="20"/>
+              </w:rPr>
+              <w:t>Q3 2026 completado: V1-03, V1-04, V1-06, V1-07, V1-15, V1-20. V1-11 marcada como Completada (con side effects pendientes).</w:t>
             </w:r>
           </w:p>
         </w:tc>
@@ -3346,6 +3362,9 @@
           </w:tcPr>
           <w:p>
             <w:r>
+              <w:rPr>
+                <w:sz w:val="20"/>
+              </w:rPr>
               <w:t>Completada</w:t>
             </w:r>
           </w:p>
@@ -3419,6 +3438,9 @@
           </w:tcPr>
           <w:p>
             <w:r>
+              <w:rPr>
+                <w:sz w:val="20"/>
+              </w:rPr>
               <w:t>Completada</w:t>
             </w:r>
           </w:p>
@@ -3561,6 +3583,9 @@
           </w:tcPr>
           <w:p>
             <w:r>
+              <w:rPr>
+                <w:sz w:val="20"/>
+              </w:rPr>
               <w:t>Completada</w:t>
             </w:r>
           </w:p>
@@ -3634,6 +3659,9 @@
           </w:tcPr>
           <w:p>
             <w:r>
+              <w:rPr>
+                <w:sz w:val="20"/>
+              </w:rPr>
               <w:t>Completada</w:t>
             </w:r>
           </w:p>
@@ -3914,6 +3942,9 @@
           </w:tcPr>
           <w:p>
             <w:r>
+              <w:rPr>
+                <w:sz w:val="20"/>
+              </w:rPr>
               <w:t>Completada</w:t>
             </w:r>
           </w:p>
@@ -4194,6 +4225,9 @@
           </w:tcPr>
           <w:p>
             <w:r>
+              <w:rPr>
+                <w:sz w:val="20"/>
+              </w:rPr>
               <w:t>Completada</w:t>
             </w:r>
           </w:p>
@@ -4543,6 +4577,9 @@
           </w:tcPr>
           <w:p>
             <w:r>
+              <w:rPr>
+                <w:sz w:val="20"/>
+              </w:rPr>
               <w:t>Completada</w:t>
             </w:r>
           </w:p>

</xml_diff>

<commit_message>
docs(audit): add 5 official .docx v1.2 + update run_server.bat
</commit_message>
<xml_diff>
--- a/docs/documentacion_oficial/09_Backlog_Producto_Custodio_RAT_Manager_v1.1.docx
+++ b/docs/documentacion_oficial/09_Backlog_Producto_Custodio_RAT_Manager_v1.1.docx
@@ -36,7 +36,7 @@
           <w:color w:val="808080"/>
           <w:sz w:val="22"/>
         </w:rPr>
-        <w:t>CUST-DOC-09b</w:t>
+        <w:t>CUST-DOC-09</w:t>
       </w:r>
     </w:p>
     <w:p/>
@@ -285,7 +285,7 @@
       <w:tr>
         <w:tc>
           <w:tcPr>
-            <w:tcW w:type="dxa" w:w="2494"/>
+            <w:tcW w:type="dxa" w:w="850"/>
             <w:shd w:val="clear" w:color="auto" w:fill="1F497D"/>
           </w:tcPr>
           <w:p>
@@ -301,7 +301,7 @@
         </w:tc>
         <w:tc>
           <w:tcPr>
-            <w:tcW w:type="dxa" w:w="2494"/>
+            <w:tcW w:type="dxa" w:w="1417"/>
             <w:shd w:val="clear" w:color="auto" w:fill="1F497D"/>
           </w:tcPr>
           <w:p>
@@ -317,7 +317,7 @@
         </w:tc>
         <w:tc>
           <w:tcPr>
-            <w:tcW w:type="dxa" w:w="2494"/>
+            <w:tcW w:type="dxa" w:w="1701"/>
             <w:shd w:val="clear" w:color="auto" w:fill="1F497D"/>
           </w:tcPr>
           <w:p>
@@ -333,7 +333,7 @@
         </w:tc>
         <w:tc>
           <w:tcPr>
-            <w:tcW w:type="dxa" w:w="2489"/>
+            <w:tcW w:type="dxa" w:w="6004"/>
             <w:shd w:val="clear" w:color="auto" w:fill="1F497D"/>
           </w:tcPr>
           <w:p>
@@ -351,48 +351,49 @@
       <w:tr>
         <w:tc>
           <w:tcPr>
+            <w:tcW w:type="dxa" w:w="850"/>
+          </w:tcPr>
+          <w:p>
+            <w:r>
+              <w:rPr>
+                <w:sz w:val="20"/>
+              </w:rPr>
+              <w:t>1.0</w:t>
+            </w:r>
+          </w:p>
+        </w:tc>
+        <w:tc>
+          <w:tcPr>
+            <w:tcW w:type="dxa" w:w="1417"/>
+          </w:tcPr>
+          <w:p>
+            <w:r>
+              <w:rPr>
+                <w:sz w:val="20"/>
+              </w:rPr>
+              <w:t>Junio 2026</w:t>
+            </w:r>
+          </w:p>
+        </w:tc>
+        <w:tc>
+          <w:tcPr>
+            <w:tcW w:type="dxa" w:w="1701"/>
+          </w:tcPr>
+          <w:p>
+            <w:r>
+              <w:rPr>
+                <w:sz w:val="20"/>
+              </w:rPr>
+              <w:t>Equipo de Desarrollo — Custodio</w:t>
+            </w:r>
+          </w:p>
+        </w:tc>
+        <w:tc>
+          <w:tcPr>
             <w:tcW w:type="dxa" w:w="2493"/>
           </w:tcPr>
           <w:p>
-            <w:r>
-              <w:rPr>
-                <w:sz w:val="20"/>
-              </w:rPr>
-              <w:t>1.0</w:t>
-            </w:r>
-          </w:p>
-        </w:tc>
-        <w:tc>
-          <w:tcPr>
-            <w:tcW w:type="dxa" w:w="2493"/>
-          </w:tcPr>
-          <w:p>
-            <w:r>
-              <w:rPr>
-                <w:sz w:val="20"/>
-              </w:rPr>
-              <w:t>Junio 2026</w:t>
-            </w:r>
-          </w:p>
-        </w:tc>
-        <w:tc>
-          <w:tcPr>
-            <w:tcW w:type="dxa" w:w="2493"/>
-          </w:tcPr>
-          <w:p>
-            <w:r>
-              <w:rPr>
-                <w:sz w:val="20"/>
-              </w:rPr>
-              <w:t>Equipo de Desarrollo — Custodio</w:t>
-            </w:r>
-          </w:p>
-        </w:tc>
-        <w:tc>
-          <w:tcPr>
-            <w:tcW w:type="dxa" w:w="2493"/>
-          </w:tcPr>
-          <w:p>
+            <w:r/>
             <w:r>
               <w:rPr>
                 <w:sz w:val="20"/>
@@ -405,111 +406,55 @@
       <w:tr>
         <w:tc>
           <w:tcPr>
+            <w:tcW w:type="dxa" w:w="850"/>
+          </w:tcPr>
+          <w:p>
+            <w:r>
+              <w:rPr>
+                <w:sz w:val="20"/>
+              </w:rPr>
+              <w:t>1.1</w:t>
+            </w:r>
+          </w:p>
+        </w:tc>
+        <w:tc>
+          <w:tcPr>
+            <w:tcW w:type="dxa" w:w="1417"/>
+          </w:tcPr>
+          <w:p>
+            <w:r>
+              <w:rPr>
+                <w:sz w:val="20"/>
+              </w:rPr>
+              <w:t>Junio 2026</w:t>
+            </w:r>
+          </w:p>
+        </w:tc>
+        <w:tc>
+          <w:tcPr>
+            <w:tcW w:type="dxa" w:w="1701"/>
+          </w:tcPr>
+          <w:p>
+            <w:r>
+              <w:rPr>
+                <w:sz w:val="20"/>
+              </w:rPr>
+              <w:t>Equipo de Desarrollo — Custodio</w:t>
+            </w:r>
+          </w:p>
+        </w:tc>
+        <w:tc>
+          <w:tcPr>
             <w:tcW w:type="dxa" w:w="2493"/>
           </w:tcPr>
           <w:p>
-            <w:r>
-              <w:rPr>
-                <w:sz w:val="20"/>
-              </w:rPr>
-              <w:t>1.1</w:t>
-            </w:r>
-          </w:p>
-        </w:tc>
-        <w:tc>
-          <w:tcPr>
-            <w:tcW w:type="dxa" w:w="2493"/>
-          </w:tcPr>
-          <w:p>
-            <w:r>
-              <w:rPr>
-                <w:sz w:val="20"/>
-              </w:rPr>
-              <w:t>Junio 2026</w:t>
-            </w:r>
-          </w:p>
-        </w:tc>
-        <w:tc>
-          <w:tcPr>
-            <w:tcW w:type="dxa" w:w="2493"/>
-          </w:tcPr>
-          <w:p>
-            <w:r>
-              <w:rPr>
-                <w:sz w:val="20"/>
-              </w:rPr>
-              <w:t>Equipo de Desarrollo — Custodio</w:t>
-            </w:r>
-          </w:p>
-        </w:tc>
-        <w:tc>
-          <w:tcPr>
-            <w:tcW w:type="dxa" w:w="2493"/>
-          </w:tcPr>
-          <w:p>
-            <w:r>
-              <w:rPr>
-                <w:sz w:val="20"/>
-              </w:rPr>
-              <w:t>Se marcan como completadas las6 HUs de la auditoría de cumplimiento (HU-A-001 a HU-A-006).</w:t>
-            </w:r>
-          </w:p>
-        </w:tc>
-      </w:tr>
-      <w:tr>
-        <w:tc>
-          <w:tcPr>
-            <w:tcW w:type="dxa" w:w="2493"/>
-          </w:tcPr>
-          <w:p>
-            <w:pPr/>
-            <w:r>
-              <w:rPr>
-                <w:sz w:val="20"/>
-              </w:rPr>
-              <w:t>1.2</w:t>
-            </w:r>
-          </w:p>
-        </w:tc>
-        <w:tc>
-          <w:tcPr>
-            <w:tcW w:type="dxa" w:w="2493"/>
-          </w:tcPr>
-          <w:p>
-            <w:pPr/>
-            <w:r>
-              <w:rPr>
-                <w:sz w:val="20"/>
-              </w:rPr>
-              <w:t>Junio 2026</w:t>
-            </w:r>
-          </w:p>
-        </w:tc>
-        <w:tc>
-          <w:tcPr>
-            <w:tcW w:type="dxa" w:w="2493"/>
-          </w:tcPr>
-          <w:p>
-            <w:pPr/>
-            <w:r>
-              <w:rPr>
-                <w:sz w:val="20"/>
-              </w:rPr>
-              <w:t>Equipo de Desarrollo — Custodio</w:t>
-            </w:r>
-          </w:p>
-        </w:tc>
-        <w:tc>
-          <w:tcPr>
-            <w:tcW w:type="dxa" w:w="2493"/>
-          </w:tcPr>
-          <w:p>
-            <w:pPr/>
-            <w:r>
-              <w:rPr>
-                <w:sz w:val="20"/>
-              </w:rPr>
-              <w:t>Q3 2026 completado: V1-03, V1-04, V1-06, V1-07, V1-15, V1-20. V1-11 marcada como Completada (con side effects pendientes).</w:t>
+            <w:r/>
+            <w:r>
+              <w:rPr>
+                <w:sz w:val="20"/>
+                <w:u w:val="single"/>
+              </w:rPr>
+              <w:t>Agregados items MVP: módulo Consentimientos (CON-02), RATs sugeridos por API (RAT-11), Tickets ARCO auto-creados (TKT-01). Actualizado V1-02 a 'UI completada'.</w:t>
             </w:r>
           </w:p>
         </w:tc>
@@ -2530,6 +2475,150 @@
                 <w:b/>
                 <w:sz w:val="20"/>
               </w:rPr>
+              <w:t>CON-02</w:t>
+            </w:r>
+          </w:p>
+        </w:tc>
+        <w:tc>
+          <w:tcPr>
+            <w:tcW w:type="dxa" w:w="7370"/>
+            <w:vAlign w:val="top"/>
+          </w:tcPr>
+          <w:p>
+            <w:r/>
+            <w:r>
+              <w:rPr>
+                <w:sz w:val="20"/>
+              </w:rPr>
+              <w:t>Módulo de Consentimientos editable1:N con RAT.</w:t>
+            </w:r>
+          </w:p>
+        </w:tc>
+        <w:tc>
+          <w:tcPr>
+            <w:tcW w:type="dxa" w:w="1644"/>
+            <w:vAlign w:val="top"/>
+          </w:tcPr>
+          <w:p>
+            <w:r/>
+            <w:r>
+              <w:rPr>
+                <w:sz w:val="20"/>
+              </w:rPr>
+              <w:t>Listo</w:t>
+            </w:r>
+          </w:p>
+        </w:tc>
+      </w:tr>
+      <w:tr>
+        <w:tc>
+          <w:tcPr>
+            <w:tcW w:type="dxa" w:w="907"/>
+            <w:vAlign w:val="top"/>
+          </w:tcPr>
+          <w:p>
+            <w:r/>
+            <w:r>
+              <w:rPr>
+                <w:b/>
+                <w:sz w:val="20"/>
+              </w:rPr>
+              <w:t>RAT-11</w:t>
+            </w:r>
+          </w:p>
+        </w:tc>
+        <w:tc>
+          <w:tcPr>
+            <w:tcW w:type="dxa" w:w="7370"/>
+            <w:vAlign w:val="top"/>
+          </w:tcPr>
+          <w:p>
+            <w:r/>
+            <w:r>
+              <w:rPr>
+                <w:sz w:val="20"/>
+              </w:rPr>
+              <w:t>Sugerencias de RAT via API (/rats-sugeridos/*).</w:t>
+            </w:r>
+          </w:p>
+        </w:tc>
+        <w:tc>
+          <w:tcPr>
+            <w:tcW w:type="dxa" w:w="1644"/>
+            <w:vAlign w:val="top"/>
+          </w:tcPr>
+          <w:p>
+            <w:r/>
+            <w:r>
+              <w:rPr>
+                <w:sz w:val="20"/>
+              </w:rPr>
+              <w:t>Listo</w:t>
+            </w:r>
+          </w:p>
+        </w:tc>
+      </w:tr>
+      <w:tr>
+        <w:tc>
+          <w:tcPr>
+            <w:tcW w:type="dxa" w:w="907"/>
+            <w:vAlign w:val="top"/>
+          </w:tcPr>
+          <w:p>
+            <w:r/>
+            <w:r>
+              <w:rPr>
+                <w:b/>
+                <w:sz w:val="20"/>
+              </w:rPr>
+              <w:t>TKT-01</w:t>
+            </w:r>
+          </w:p>
+        </w:tc>
+        <w:tc>
+          <w:tcPr>
+            <w:tcW w:type="dxa" w:w="7370"/>
+            <w:vAlign w:val="top"/>
+          </w:tcPr>
+          <w:p>
+            <w:r/>
+            <w:r>
+              <w:rPr>
+                <w:sz w:val="20"/>
+              </w:rPr>
+              <w:t>Tickets ARCO auto-creados al recibir solicitud ARCO.</w:t>
+            </w:r>
+          </w:p>
+        </w:tc>
+        <w:tc>
+          <w:tcPr>
+            <w:tcW w:type="dxa" w:w="1644"/>
+            <w:vAlign w:val="top"/>
+          </w:tcPr>
+          <w:p>
+            <w:r/>
+            <w:r>
+              <w:rPr>
+                <w:sz w:val="20"/>
+              </w:rPr>
+              <w:t>Listo</w:t>
+            </w:r>
+          </w:p>
+        </w:tc>
+      </w:tr>
+      <w:tr>
+        <w:tc>
+          <w:tcPr>
+            <w:tcW w:type="dxa" w:w="907"/>
+            <w:vAlign w:val="top"/>
+          </w:tcPr>
+          <w:p>
+            <w:r/>
+            <w:r>
+              <w:rPr>
+                <w:b/>
+                <w:sz w:val="20"/>
+              </w:rPr>
               <w:t>AUD-01</w:t>
             </w:r>
           </w:p>
@@ -2590,11 +2679,10 @@
         <w:tblLook w:firstColumn="1" w:firstRow="1" w:lastColumn="0" w:lastRow="0" w:noHBand="0" w:noVBand="1" w:val="04A0"/>
       </w:tblPr>
       <w:tblGrid>
-        <w:gridCol w:w="1994"/>
-        <w:gridCol w:w="1994"/>
-        <w:gridCol w:w="1994"/>
-        <w:gridCol w:w="1994"/>
-        <w:gridCol w:w="1994"/>
+        <w:gridCol w:w="2493"/>
+        <w:gridCol w:w="2493"/>
+        <w:gridCol w:w="2493"/>
+        <w:gridCol w:w="2493"/>
       </w:tblGrid>
       <w:tr>
         <w:tc>
@@ -2617,7 +2705,7 @@
         </w:tc>
         <w:tc>
           <w:tcPr>
-            <w:tcW w:type="dxa" w:w="5669"/>
+            <w:tcW w:type="dxa" w:w="6236"/>
             <w:shd w:val="clear" w:color="auto" w:fill="D9E2F3"/>
             <w:vAlign w:val="center"/>
           </w:tcPr>
@@ -2653,24 +2741,6 @@
         </w:tc>
         <w:tc>
           <w:tcPr>
-            <w:tcW w:type="dxa" w:w="1134"/>
-            <w:shd w:val="clear" w:color="auto" w:fill="D9E2F3"/>
-            <w:vAlign w:val="center"/>
-          </w:tcPr>
-          <w:p>
-            <w:r/>
-            <w:r>
-              <w:rPr>
-                <w:b/>
-                <w:color w:val="1F497D"/>
-                <w:sz w:val="20"/>
-              </w:rPr>
-              <w:t>Tamaño</w:t>
-            </w:r>
-          </w:p>
-        </w:tc>
-        <w:tc>
-          <w:tcPr>
             <w:tcW w:type="dxa" w:w="1304"/>
             <w:shd w:val="clear" w:color="auto" w:fill="D9E2F3"/>
             <w:vAlign w:val="center"/>
@@ -2683,7 +2753,7 @@
                 <w:color w:val="1F497D"/>
                 <w:sz w:val="20"/>
               </w:rPr>
-              <w:t>Estado</w:t>
+              <w:t>Tamaño</w:t>
             </w:r>
           </w:p>
         </w:tc>
@@ -2701,13 +2771,13 @@
                 <w:b/>
                 <w:sz w:val="20"/>
               </w:rPr>
-              <w:t>HU-A-001</w:t>
-            </w:r>
-          </w:p>
-        </w:tc>
-        <w:tc>
-          <w:tcPr>
-            <w:tcW w:type="dxa" w:w="5669"/>
+              <w:t>V1-01</w:t>
+            </w:r>
+          </w:p>
+        </w:tc>
+        <w:tc>
+          <w:tcPr>
+            <w:tcW w:type="dxa" w:w="6236"/>
             <w:vAlign w:val="top"/>
           </w:tcPr>
           <w:p>
@@ -2716,7 +2786,7 @@
               <w:rPr>
                 <w:sz w:val="20"/>
               </w:rPr>
-              <w:t>Workflow de Bloqueo Temporal (REC-01)</w:t>
+              <w:t>EIPD (Evaluación de Impacto) como módulo editable 1:1 con RAT.</w:t>
             </w:r>
           </w:p>
         </w:tc>
@@ -2731,22 +2801,7 @@
               <w:rPr>
                 <w:sz w:val="20"/>
               </w:rPr>
-              <w:t>Crítica</w:t>
-            </w:r>
-          </w:p>
-        </w:tc>
-        <w:tc>
-          <w:tcPr>
-            <w:tcW w:type="dxa" w:w="1134"/>
-            <w:vAlign w:val="top"/>
-          </w:tcPr>
-          <w:p>
-            <w:r/>
-            <w:r>
-              <w:rPr>
-                <w:sz w:val="20"/>
-              </w:rPr>
-              <w:t>8</w:t>
+              <w:t>Alta</w:t>
             </w:r>
           </w:p>
         </w:tc>
@@ -2761,7 +2816,7 @@
               <w:rPr>
                 <w:sz w:val="20"/>
               </w:rPr>
-              <w:t>Completada</w:t>
+              <w:t>8</w:t>
             </w:r>
           </w:p>
         </w:tc>
@@ -2779,13 +2834,13 @@
                 <w:b/>
                 <w:sz w:val="20"/>
               </w:rPr>
-              <w:t>HU-A-002</w:t>
-            </w:r>
-          </w:p>
-        </w:tc>
-        <w:tc>
-          <w:tcPr>
-            <w:tcW w:type="dxa" w:w="5669"/>
+              <w:t>V1-02</w:t>
+            </w:r>
+          </w:p>
+        </w:tc>
+        <w:tc>
+          <w:tcPr>
+            <w:tcW w:type="dxa" w:w="6236"/>
             <w:vAlign w:val="top"/>
           </w:tcPr>
           <w:p>
@@ -2794,7 +2849,7 @@
               <w:rPr>
                 <w:sz w:val="20"/>
               </w:rPr>
-              <w:t>Módulo de Transparencia Pública (REC-02)</w:t>
+              <w:t>Consentimientos como módulo editable 1:N con RAT (UI completada en v1.1).</w:t>
             </w:r>
           </w:p>
         </w:tc>
@@ -2809,22 +2864,7 @@
               <w:rPr>
                 <w:sz w:val="20"/>
               </w:rPr>
-              <w:t>Crítica</w:t>
-            </w:r>
-          </w:p>
-        </w:tc>
-        <w:tc>
-          <w:tcPr>
-            <w:tcW w:type="dxa" w:w="1134"/>
-            <w:vAlign w:val="top"/>
-          </w:tcPr>
-          <w:p>
-            <w:r/>
-            <w:r>
-              <w:rPr>
-                <w:sz w:val="20"/>
-              </w:rPr>
-              <w:t>8</w:t>
+              <w:t>Alta</w:t>
             </w:r>
           </w:p>
         </w:tc>
@@ -2839,7 +2879,7 @@
               <w:rPr>
                 <w:sz w:val="20"/>
               </w:rPr>
-              <w:t>Completada</w:t>
+              <w:t>8</w:t>
             </w:r>
           </w:p>
         </w:tc>
@@ -2857,13 +2897,13 @@
                 <w:b/>
                 <w:sz w:val="20"/>
               </w:rPr>
-              <w:t>HU-A-003</w:t>
-            </w:r>
-          </w:p>
-        </w:tc>
-        <w:tc>
-          <w:tcPr>
-            <w:tcW w:type="dxa" w:w="5669"/>
+              <w:t>V1-03</w:t>
+            </w:r>
+          </w:p>
+        </w:tc>
+        <w:tc>
+          <w:tcPr>
+            <w:tcW w:type="dxa" w:w="6236"/>
             <w:vAlign w:val="top"/>
           </w:tcPr>
           <w:p>
@@ -2872,7 +2912,7 @@
               <w:rPr>
                 <w:sz w:val="20"/>
               </w:rPr>
-              <w:t>Contrato formal de Encargado (REC-03)</w:t>
+              <w:t>Onboarding interactivo con checklist de progreso para nuevas empresas.</w:t>
             </w:r>
           </w:p>
         </w:tc>
@@ -2887,22 +2927,7 @@
               <w:rPr>
                 <w:sz w:val="20"/>
               </w:rPr>
-              <w:t>Crítica</w:t>
-            </w:r>
-          </w:p>
-        </w:tc>
-        <w:tc>
-          <w:tcPr>
-            <w:tcW w:type="dxa" w:w="1134"/>
-            <w:vAlign w:val="top"/>
-          </w:tcPr>
-          <w:p>
-            <w:r/>
-            <w:r>
-              <w:rPr>
-                <w:sz w:val="20"/>
-              </w:rPr>
-              <w:t>8</w:t>
+              <w:t>Media</w:t>
             </w:r>
           </w:p>
         </w:tc>
@@ -2917,7 +2942,7 @@
               <w:rPr>
                 <w:sz w:val="20"/>
               </w:rPr>
-              <w:t>Completada</w:t>
+              <w:t>5</w:t>
             </w:r>
           </w:p>
         </w:tc>
@@ -2935,13 +2960,13 @@
                 <w:b/>
                 <w:sz w:val="20"/>
               </w:rPr>
-              <w:t>HU-A-004</w:t>
-            </w:r>
-          </w:p>
-        </w:tc>
-        <w:tc>
-          <w:tcPr>
-            <w:tcW w:type="dxa" w:w="5669"/>
+              <w:t>V1-04</w:t>
+            </w:r>
+          </w:p>
+        </w:tc>
+        <w:tc>
+          <w:tcPr>
+            <w:tcW w:type="dxa" w:w="6236"/>
             <w:vAlign w:val="top"/>
           </w:tcPr>
           <w:p>
@@ -2950,7 +2975,7 @@
               <w:rPr>
                 <w:sz w:val="20"/>
               </w:rPr>
-              <w:t>Portabilidad per-titular JSON/XML (REC-04)</w:t>
+              <w:t>Wizard 0 de selección de rubro + plantilla sugerida al crear RAT.</w:t>
             </w:r>
           </w:p>
         </w:tc>
@@ -2965,22 +2990,7 @@
               <w:rPr>
                 <w:sz w:val="20"/>
               </w:rPr>
-              <w:t>Crítica</w:t>
-            </w:r>
-          </w:p>
-        </w:tc>
-        <w:tc>
-          <w:tcPr>
-            <w:tcW w:type="dxa" w:w="1134"/>
-            <w:vAlign w:val="top"/>
-          </w:tcPr>
-          <w:p>
-            <w:r/>
-            <w:r>
-              <w:rPr>
-                <w:sz w:val="20"/>
-              </w:rPr>
-              <w:t>8</w:t>
+              <w:t>Alta</w:t>
             </w:r>
           </w:p>
         </w:tc>
@@ -2995,7 +3005,7 @@
               <w:rPr>
                 <w:sz w:val="20"/>
               </w:rPr>
-              <w:t>Completada</w:t>
+              <w:t>5</w:t>
             </w:r>
           </w:p>
         </w:tc>
@@ -3013,13 +3023,13 @@
                 <w:b/>
                 <w:sz w:val="20"/>
               </w:rPr>
-              <w:t>HU-A-005</w:t>
-            </w:r>
-          </w:p>
-        </w:tc>
-        <w:tc>
-          <w:tcPr>
-            <w:tcW w:type="dxa" w:w="5669"/>
+              <w:t>V1-05</w:t>
+            </w:r>
+          </w:p>
+        </w:tc>
+        <w:tc>
+          <w:tcPr>
+            <w:tcW w:type="dxa" w:w="6236"/>
             <w:vAlign w:val="top"/>
           </w:tcPr>
           <w:p>
@@ -3028,7 +3038,7 @@
               <w:rPr>
                 <w:sz w:val="20"/>
               </w:rPr>
-              <w:t>Filtro de riesgo razonable en Brechas (REC-05)</w:t>
+              <w:t>Drag-to-reorder de rubros y sugerencias.</w:t>
             </w:r>
           </w:p>
         </w:tc>
@@ -3043,22 +3053,7 @@
               <w:rPr>
                 <w:sz w:val="20"/>
               </w:rPr>
-              <w:t>Crítica</w:t>
-            </w:r>
-          </w:p>
-        </w:tc>
-        <w:tc>
-          <w:tcPr>
-            <w:tcW w:type="dxa" w:w="1134"/>
-            <w:vAlign w:val="top"/>
-          </w:tcPr>
-          <w:p>
-            <w:r/>
-            <w:r>
-              <w:rPr>
-                <w:sz w:val="20"/>
-              </w:rPr>
-              <w:t>5</w:t>
+              <w:t>Media</w:t>
             </w:r>
           </w:p>
         </w:tc>
@@ -3073,7 +3068,7 @@
               <w:rPr>
                 <w:sz w:val="20"/>
               </w:rPr>
-              <w:t>Completada</w:t>
+              <w:t>3</w:t>
             </w:r>
           </w:p>
         </w:tc>
@@ -3091,13 +3086,13 @@
                 <w:b/>
                 <w:sz w:val="20"/>
               </w:rPr>
-              <w:t>HU-A-006</w:t>
-            </w:r>
-          </w:p>
-        </w:tc>
-        <w:tc>
-          <w:tcPr>
-            <w:tcW w:type="dxa" w:w="5669"/>
+              <w:t>V1-06</w:t>
+            </w:r>
+          </w:p>
+        </w:tc>
+        <w:tc>
+          <w:tcPr>
+            <w:tcW w:type="dxa" w:w="6236"/>
             <w:vAlign w:val="top"/>
           </w:tcPr>
           <w:p>
@@ -3106,7 +3101,7 @@
               <w:rPr>
                 <w:sz w:val="20"/>
               </w:rPr>
-              <w:t>Consentimiento expreso para datos sensibles (REC-06)</w:t>
+              <w:t>Notificaciones por email ante vencimiento de RAT y brechas.</w:t>
             </w:r>
           </w:p>
         </w:tc>
@@ -3121,22 +3116,7 @@
               <w:rPr>
                 <w:sz w:val="20"/>
               </w:rPr>
-              <w:t>Crítica</w:t>
-            </w:r>
-          </w:p>
-        </w:tc>
-        <w:tc>
-          <w:tcPr>
-            <w:tcW w:type="dxa" w:w="1134"/>
-            <w:vAlign w:val="top"/>
-          </w:tcPr>
-          <w:p>
-            <w:r/>
-            <w:r>
-              <w:rPr>
-                <w:sz w:val="20"/>
-              </w:rPr>
-              <w:t>3</w:t>
+              <w:t>Alta</w:t>
             </w:r>
           </w:p>
         </w:tc>
@@ -3151,7 +3131,7 @@
               <w:rPr>
                 <w:sz w:val="20"/>
               </w:rPr>
-              <w:t>Completada</w:t>
+              <w:t>8</w:t>
             </w:r>
           </w:p>
         </w:tc>
@@ -3169,13 +3149,13 @@
                 <w:b/>
                 <w:sz w:val="20"/>
               </w:rPr>
-              <w:t>V1-01</w:t>
-            </w:r>
-          </w:p>
-        </w:tc>
-        <w:tc>
-          <w:tcPr>
-            <w:tcW w:type="dxa" w:w="5669"/>
+              <w:t>V1-07</w:t>
+            </w:r>
+          </w:p>
+        </w:tc>
+        <w:tc>
+          <w:tcPr>
+            <w:tcW w:type="dxa" w:w="6236"/>
             <w:vAlign w:val="top"/>
           </w:tcPr>
           <w:p>
@@ -3184,7 +3164,7 @@
               <w:rPr>
                 <w:sz w:val="20"/>
               </w:rPr>
-              <w:t>EIPD (Evaluación de Impacto) como módulo editable 1:1 con RAT.</w:t>
+              <w:t>Notificaciones por email a titulares al responder ARCO.</w:t>
             </w:r>
           </w:p>
         </w:tc>
@@ -3205,7 +3185,7 @@
         </w:tc>
         <w:tc>
           <w:tcPr>
-            <w:tcW w:type="dxa" w:w="1134"/>
+            <w:tcW w:type="dxa" w:w="1304"/>
             <w:vAlign w:val="top"/>
           </w:tcPr>
           <w:p>
@@ -3214,15 +3194,9 @@
               <w:rPr>
                 <w:sz w:val="20"/>
               </w:rPr>
-              <w:t>8</w:t>
-            </w:r>
-          </w:p>
-        </w:tc>
-        <w:tc>
-          <w:tcPr>
-            <w:tcW w:type="dxa" w:w="1304"/>
-          </w:tcPr>
-          <w:p/>
+              <w:t>5</w:t>
+            </w:r>
+          </w:p>
         </w:tc>
       </w:tr>
       <w:tr>
@@ -3238,13 +3212,13 @@
                 <w:b/>
                 <w:sz w:val="20"/>
               </w:rPr>
-              <w:t>V1-02</w:t>
-            </w:r>
-          </w:p>
-        </w:tc>
-        <w:tc>
-          <w:tcPr>
-            <w:tcW w:type="dxa" w:w="5669"/>
+              <w:t>V1-08</w:t>
+            </w:r>
+          </w:p>
+        </w:tc>
+        <w:tc>
+          <w:tcPr>
+            <w:tcW w:type="dxa" w:w="6236"/>
             <w:vAlign w:val="top"/>
           </w:tcPr>
           <w:p>
@@ -3253,7 +3227,7 @@
               <w:rPr>
                 <w:sz w:val="20"/>
               </w:rPr>
-              <w:t>Consentimientos como módulo editable 1:N con RAT (ya existe el modelo, falta UI completa).</w:t>
+              <w:t>Tests E2E con Playwright en CI.</w:t>
             </w:r>
           </w:p>
         </w:tc>
@@ -3274,7 +3248,7 @@
         </w:tc>
         <w:tc>
           <w:tcPr>
-            <w:tcW w:type="dxa" w:w="1134"/>
+            <w:tcW w:type="dxa" w:w="1304"/>
             <w:vAlign w:val="top"/>
           </w:tcPr>
           <w:p>
@@ -3286,12 +3260,6 @@
               <w:t>8</w:t>
             </w:r>
           </w:p>
-        </w:tc>
-        <w:tc>
-          <w:tcPr>
-            <w:tcW w:type="dxa" w:w="1304"/>
-          </w:tcPr>
-          <w:p/>
         </w:tc>
       </w:tr>
       <w:tr>
@@ -3307,13 +3275,13 @@
                 <w:b/>
                 <w:sz w:val="20"/>
               </w:rPr>
-              <w:t>V1-03</w:t>
-            </w:r>
-          </w:p>
-        </w:tc>
-        <w:tc>
-          <w:tcPr>
-            <w:tcW w:type="dxa" w:w="5669"/>
+              <w:t>V1-09</w:t>
+            </w:r>
+          </w:p>
+        </w:tc>
+        <w:tc>
+          <w:tcPr>
+            <w:tcW w:type="dxa" w:w="6236"/>
             <w:vAlign w:val="top"/>
           </w:tcPr>
           <w:p>
@@ -3322,7 +3290,7 @@
               <w:rPr>
                 <w:sz w:val="20"/>
               </w:rPr>
-              <w:t>Onboarding interactivo con checklist de progreso para nuevas empresas.</w:t>
+              <w:t>Suite de tests unitarios del frontend con Vitest.</w:t>
             </w:r>
           </w:p>
         </w:tc>
@@ -3337,13 +3305,13 @@
               <w:rPr>
                 <w:sz w:val="20"/>
               </w:rPr>
-              <w:t>Media</w:t>
-            </w:r>
-          </w:p>
-        </w:tc>
-        <w:tc>
-          <w:tcPr>
-            <w:tcW w:type="dxa" w:w="1134"/>
+              <w:t>Alta</w:t>
+            </w:r>
+          </w:p>
+        </w:tc>
+        <w:tc>
+          <w:tcPr>
+            <w:tcW w:type="dxa" w:w="1304"/>
             <w:vAlign w:val="top"/>
           </w:tcPr>
           <w:p>
@@ -3353,19 +3321,6 @@
                 <w:sz w:val="20"/>
               </w:rPr>
               <w:t>5</w:t>
-            </w:r>
-          </w:p>
-        </w:tc>
-        <w:tc>
-          <w:tcPr>
-            <w:tcW w:type="dxa" w:w="1304"/>
-          </w:tcPr>
-          <w:p>
-            <w:r>
-              <w:rPr>
-                <w:sz w:val="20"/>
-              </w:rPr>
-              <w:t>Completada</w:t>
             </w:r>
           </w:p>
         </w:tc>
@@ -3383,13 +3338,13 @@
                 <w:b/>
                 <w:sz w:val="20"/>
               </w:rPr>
-              <w:t>V1-04</w:t>
-            </w:r>
-          </w:p>
-        </w:tc>
-        <w:tc>
-          <w:tcPr>
-            <w:tcW w:type="dxa" w:w="5669"/>
+              <w:t>V1-10</w:t>
+            </w:r>
+          </w:p>
+        </w:tc>
+        <w:tc>
+          <w:tcPr>
+            <w:tcW w:type="dxa" w:w="6236"/>
             <w:vAlign w:val="top"/>
           </w:tcPr>
           <w:p>
@@ -3398,7 +3353,7 @@
               <w:rPr>
                 <w:sz w:val="20"/>
               </w:rPr>
-              <w:t>Wizard 0 de selección de rubro + plantilla sugerida al crear RAT.</w:t>
+              <w:t>Internacionalización del frontend (es/en).</w:t>
             </w:r>
           </w:p>
         </w:tc>
@@ -3413,13 +3368,13 @@
               <w:rPr>
                 <w:sz w:val="20"/>
               </w:rPr>
-              <w:t>Alta</w:t>
-            </w:r>
-          </w:p>
-        </w:tc>
-        <w:tc>
-          <w:tcPr>
-            <w:tcW w:type="dxa" w:w="1134"/>
+              <w:t>Media</w:t>
+            </w:r>
+          </w:p>
+        </w:tc>
+        <w:tc>
+          <w:tcPr>
+            <w:tcW w:type="dxa" w:w="1304"/>
             <w:vAlign w:val="top"/>
           </w:tcPr>
           <w:p>
@@ -3429,19 +3384,6 @@
                 <w:sz w:val="20"/>
               </w:rPr>
               <w:t>5</w:t>
-            </w:r>
-          </w:p>
-        </w:tc>
-        <w:tc>
-          <w:tcPr>
-            <w:tcW w:type="dxa" w:w="1304"/>
-          </w:tcPr>
-          <w:p>
-            <w:r>
-              <w:rPr>
-                <w:sz w:val="20"/>
-              </w:rPr>
-              <w:t>Completada</w:t>
             </w:r>
           </w:p>
         </w:tc>
@@ -3459,13 +3401,13 @@
                 <w:b/>
                 <w:sz w:val="20"/>
               </w:rPr>
-              <w:t>V1-05</w:t>
-            </w:r>
-          </w:p>
-        </w:tc>
-        <w:tc>
-          <w:tcPr>
-            <w:tcW w:type="dxa" w:w="5669"/>
+              <w:t>V1-11</w:t>
+            </w:r>
+          </w:p>
+        </w:tc>
+        <w:tc>
+          <w:tcPr>
+            <w:tcW w:type="dxa" w:w="6236"/>
             <w:vAlign w:val="top"/>
           </w:tcPr>
           <w:p>
@@ -3474,7 +3416,7 @@
               <w:rPr>
                 <w:sz w:val="20"/>
               </w:rPr>
-              <w:t>Drag-to-reorder de rubros y sugerencias.</w:t>
+              <w:t>Modo oscuro con switch en Topbar.</w:t>
             </w:r>
           </w:p>
         </w:tc>
@@ -3489,13 +3431,13 @@
               <w:rPr>
                 <w:sz w:val="20"/>
               </w:rPr>
-              <w:t>Media</w:t>
-            </w:r>
-          </w:p>
-        </w:tc>
-        <w:tc>
-          <w:tcPr>
-            <w:tcW w:type="dxa" w:w="1134"/>
+              <w:t>Baja</w:t>
+            </w:r>
+          </w:p>
+        </w:tc>
+        <w:tc>
+          <w:tcPr>
+            <w:tcW w:type="dxa" w:w="1304"/>
             <w:vAlign w:val="top"/>
           </w:tcPr>
           <w:p>
@@ -3507,12 +3449,6 @@
               <w:t>3</w:t>
             </w:r>
           </w:p>
-        </w:tc>
-        <w:tc>
-          <w:tcPr>
-            <w:tcW w:type="dxa" w:w="1304"/>
-          </w:tcPr>
-          <w:p/>
         </w:tc>
       </w:tr>
       <w:tr>
@@ -3528,13 +3464,13 @@
                 <w:b/>
                 <w:sz w:val="20"/>
               </w:rPr>
-              <w:t>V1-06</w:t>
-            </w:r>
-          </w:p>
-        </w:tc>
-        <w:tc>
-          <w:tcPr>
-            <w:tcW w:type="dxa" w:w="5669"/>
+              <w:t>V1-12</w:t>
+            </w:r>
+          </w:p>
+        </w:tc>
+        <w:tc>
+          <w:tcPr>
+            <w:tcW w:type="dxa" w:w="6236"/>
             <w:vAlign w:val="top"/>
           </w:tcPr>
           <w:p>
@@ -3543,7 +3479,7 @@
               <w:rPr>
                 <w:sz w:val="20"/>
               </w:rPr>
-              <w:t>Notificaciones por email ante vencimiento de RAT y brechas.</w:t>
+              <w:t>PWA instalable con Service Worker.</w:t>
             </w:r>
           </w:p>
         </w:tc>
@@ -3558,13 +3494,13 @@
               <w:rPr>
                 <w:sz w:val="20"/>
               </w:rPr>
-              <w:t>Alta</w:t>
-            </w:r>
-          </w:p>
-        </w:tc>
-        <w:tc>
-          <w:tcPr>
-            <w:tcW w:type="dxa" w:w="1134"/>
+              <w:t>Baja</w:t>
+            </w:r>
+          </w:p>
+        </w:tc>
+        <w:tc>
+          <w:tcPr>
+            <w:tcW w:type="dxa" w:w="1304"/>
             <w:vAlign w:val="top"/>
           </w:tcPr>
           <w:p>
@@ -3573,20 +3509,7 @@
               <w:rPr>
                 <w:sz w:val="20"/>
               </w:rPr>
-              <w:t>8</w:t>
-            </w:r>
-          </w:p>
-        </w:tc>
-        <w:tc>
-          <w:tcPr>
-            <w:tcW w:type="dxa" w:w="1304"/>
-          </w:tcPr>
-          <w:p>
-            <w:r>
-              <w:rPr>
-                <w:sz w:val="20"/>
-              </w:rPr>
-              <w:t>Completada</w:t>
+              <w:t>5</w:t>
             </w:r>
           </w:p>
         </w:tc>
@@ -3604,13 +3527,13 @@
                 <w:b/>
                 <w:sz w:val="20"/>
               </w:rPr>
-              <w:t>V1-07</w:t>
-            </w:r>
-          </w:p>
-        </w:tc>
-        <w:tc>
-          <w:tcPr>
-            <w:tcW w:type="dxa" w:w="5669"/>
+              <w:t>V1-13</w:t>
+            </w:r>
+          </w:p>
+        </w:tc>
+        <w:tc>
+          <w:tcPr>
+            <w:tcW w:type="dxa" w:w="6236"/>
             <w:vAlign w:val="top"/>
           </w:tcPr>
           <w:p>
@@ -3619,7 +3542,7 @@
               <w:rPr>
                 <w:sz w:val="20"/>
               </w:rPr>
-              <w:t>Notificaciones por email a titulares al responder ARCO.</w:t>
+              <w:t>Exportación XLSX además de CSV.</w:t>
             </w:r>
           </w:p>
         </w:tc>
@@ -3634,13 +3557,13 @@
               <w:rPr>
                 <w:sz w:val="20"/>
               </w:rPr>
-              <w:t>Alta</w:t>
-            </w:r>
-          </w:p>
-        </w:tc>
-        <w:tc>
-          <w:tcPr>
-            <w:tcW w:type="dxa" w:w="1134"/>
+              <w:t>Baja</w:t>
+            </w:r>
+          </w:p>
+        </w:tc>
+        <w:tc>
+          <w:tcPr>
+            <w:tcW w:type="dxa" w:w="1304"/>
             <w:vAlign w:val="top"/>
           </w:tcPr>
           <w:p>
@@ -3649,20 +3572,7 @@
               <w:rPr>
                 <w:sz w:val="20"/>
               </w:rPr>
-              <w:t>5</w:t>
-            </w:r>
-          </w:p>
-        </w:tc>
-        <w:tc>
-          <w:tcPr>
-            <w:tcW w:type="dxa" w:w="1304"/>
-          </w:tcPr>
-          <w:p>
-            <w:r>
-              <w:rPr>
-                <w:sz w:val="20"/>
-              </w:rPr>
-              <w:t>Completada</w:t>
+              <w:t>2</w:t>
             </w:r>
           </w:p>
         </w:tc>
@@ -3680,13 +3590,13 @@
                 <w:b/>
                 <w:sz w:val="20"/>
               </w:rPr>
-              <w:t>V1-08</w:t>
-            </w:r>
-          </w:p>
-        </w:tc>
-        <w:tc>
-          <w:tcPr>
-            <w:tcW w:type="dxa" w:w="5669"/>
+              <w:t>V1-14</w:t>
+            </w:r>
+          </w:p>
+        </w:tc>
+        <w:tc>
+          <w:tcPr>
+            <w:tcW w:type="dxa" w:w="6236"/>
             <w:vAlign w:val="top"/>
           </w:tcPr>
           <w:p>
@@ -3695,7 +3605,7 @@
               <w:rPr>
                 <w:sz w:val="20"/>
               </w:rPr>
-              <w:t>Tests E2E con Playwright en CI.</w:t>
+              <w:t>API versionada con prefijo /v1/ en rutas.</w:t>
             </w:r>
           </w:p>
         </w:tc>
@@ -3710,13 +3620,13 @@
               <w:rPr>
                 <w:sz w:val="20"/>
               </w:rPr>
-              <w:t>Alta</w:t>
-            </w:r>
-          </w:p>
-        </w:tc>
-        <w:tc>
-          <w:tcPr>
-            <w:tcW w:type="dxa" w:w="1134"/>
+              <w:t>Media</w:t>
+            </w:r>
+          </w:p>
+        </w:tc>
+        <w:tc>
+          <w:tcPr>
+            <w:tcW w:type="dxa" w:w="1304"/>
             <w:vAlign w:val="top"/>
           </w:tcPr>
           <w:p>
@@ -3725,15 +3635,9 @@
               <w:rPr>
                 <w:sz w:val="20"/>
               </w:rPr>
-              <w:t>8</w:t>
-            </w:r>
-          </w:p>
-        </w:tc>
-        <w:tc>
-          <w:tcPr>
-            <w:tcW w:type="dxa" w:w="1304"/>
-          </w:tcPr>
-          <w:p/>
+              <w:t>5</w:t>
+            </w:r>
+          </w:p>
         </w:tc>
       </w:tr>
       <w:tr>
@@ -3749,13 +3653,13 @@
                 <w:b/>
                 <w:sz w:val="20"/>
               </w:rPr>
-              <w:t>V1-09</w:t>
-            </w:r>
-          </w:p>
-        </w:tc>
-        <w:tc>
-          <w:tcPr>
-            <w:tcW w:type="dxa" w:w="5669"/>
+              <w:t>V1-15</w:t>
+            </w:r>
+          </w:p>
+        </w:tc>
+        <w:tc>
+          <w:tcPr>
+            <w:tcW w:type="dxa" w:w="6236"/>
             <w:vAlign w:val="top"/>
           </w:tcPr>
           <w:p>
@@ -3764,7 +3668,7 @@
               <w:rPr>
                 <w:sz w:val="20"/>
               </w:rPr>
-              <w:t>Suite de tests unitarios del frontend con Vitest.</w:t>
+              <w:t>Hardening de CORS: lista blanca explícita en lugar de regex amplia.</w:t>
             </w:r>
           </w:p>
         </w:tc>
@@ -3785,7 +3689,7 @@
         </w:tc>
         <w:tc>
           <w:tcPr>
-            <w:tcW w:type="dxa" w:w="1134"/>
+            <w:tcW w:type="dxa" w:w="1304"/>
             <w:vAlign w:val="top"/>
           </w:tcPr>
           <w:p>
@@ -3794,15 +3698,9 @@
               <w:rPr>
                 <w:sz w:val="20"/>
               </w:rPr>
-              <w:t>5</w:t>
-            </w:r>
-          </w:p>
-        </w:tc>
-        <w:tc>
-          <w:tcPr>
-            <w:tcW w:type="dxa" w:w="1304"/>
-          </w:tcPr>
-          <w:p/>
+              <w:t>3</w:t>
+            </w:r>
+          </w:p>
         </w:tc>
       </w:tr>
       <w:tr>
@@ -3818,13 +3716,13 @@
                 <w:b/>
                 <w:sz w:val="20"/>
               </w:rPr>
-              <w:t>V1-10</w:t>
-            </w:r>
-          </w:p>
-        </w:tc>
-        <w:tc>
-          <w:tcPr>
-            <w:tcW w:type="dxa" w:w="5669"/>
+              <w:t>V1-16</w:t>
+            </w:r>
+          </w:p>
+        </w:tc>
+        <w:tc>
+          <w:tcPr>
+            <w:tcW w:type="dxa" w:w="6236"/>
             <w:vAlign w:val="top"/>
           </w:tcPr>
           <w:p>
@@ -3833,7 +3731,7 @@
               <w:rPr>
                 <w:sz w:val="20"/>
               </w:rPr>
-              <w:t>Internacionalización del frontend (es/en).</w:t>
+              <w:t>Paginación cursor-based en listados largos.</w:t>
             </w:r>
           </w:p>
         </w:tc>
@@ -3854,7 +3752,7 @@
         </w:tc>
         <w:tc>
           <w:tcPr>
-            <w:tcW w:type="dxa" w:w="1134"/>
+            <w:tcW w:type="dxa" w:w="1304"/>
             <w:vAlign w:val="top"/>
           </w:tcPr>
           <w:p>
@@ -3863,15 +3761,9 @@
               <w:rPr>
                 <w:sz w:val="20"/>
               </w:rPr>
-              <w:t>5</w:t>
-            </w:r>
-          </w:p>
-        </w:tc>
-        <w:tc>
-          <w:tcPr>
-            <w:tcW w:type="dxa" w:w="1304"/>
-          </w:tcPr>
-          <w:p/>
+              <w:t>3</w:t>
+            </w:r>
+          </w:p>
         </w:tc>
       </w:tr>
       <w:tr>
@@ -3887,13 +3779,13 @@
                 <w:b/>
                 <w:sz w:val="20"/>
               </w:rPr>
-              <w:t>V1-11</w:t>
-            </w:r>
-          </w:p>
-        </w:tc>
-        <w:tc>
-          <w:tcPr>
-            <w:tcW w:type="dxa" w:w="5669"/>
+              <w:t>V1-17</w:t>
+            </w:r>
+          </w:p>
+        </w:tc>
+        <w:tc>
+          <w:tcPr>
+            <w:tcW w:type="dxa" w:w="6236"/>
             <w:vAlign w:val="top"/>
           </w:tcPr>
           <w:p>
@@ -3902,7 +3794,7 @@
               <w:rPr>
                 <w:sz w:val="20"/>
               </w:rPr>
-              <w:t>Modo oscuro con switch en Topbar.</w:t>
+              <w:t>Plantillas de correo configurables para notificaciones.</w:t>
             </w:r>
           </w:p>
         </w:tc>
@@ -3917,13 +3809,13 @@
               <w:rPr>
                 <w:sz w:val="20"/>
               </w:rPr>
-              <w:t>Baja</w:t>
-            </w:r>
-          </w:p>
-        </w:tc>
-        <w:tc>
-          <w:tcPr>
-            <w:tcW w:type="dxa" w:w="1134"/>
+              <w:t>Media</w:t>
+            </w:r>
+          </w:p>
+        </w:tc>
+        <w:tc>
+          <w:tcPr>
+            <w:tcW w:type="dxa" w:w="1304"/>
             <w:vAlign w:val="top"/>
           </w:tcPr>
           <w:p>
@@ -3932,20 +3824,7 @@
               <w:rPr>
                 <w:sz w:val="20"/>
               </w:rPr>
-              <w:t>3</w:t>
-            </w:r>
-          </w:p>
-        </w:tc>
-        <w:tc>
-          <w:tcPr>
-            <w:tcW w:type="dxa" w:w="1304"/>
-          </w:tcPr>
-          <w:p>
-            <w:r>
-              <w:rPr>
-                <w:sz w:val="20"/>
-              </w:rPr>
-              <w:t>Completada</w:t>
+              <w:t>5</w:t>
             </w:r>
           </w:p>
         </w:tc>
@@ -3963,13 +3842,13 @@
                 <w:b/>
                 <w:sz w:val="20"/>
               </w:rPr>
-              <w:t>V1-12</w:t>
-            </w:r>
-          </w:p>
-        </w:tc>
-        <w:tc>
-          <w:tcPr>
-            <w:tcW w:type="dxa" w:w="5669"/>
+              <w:t>V1-18</w:t>
+            </w:r>
+          </w:p>
+        </w:tc>
+        <w:tc>
+          <w:tcPr>
+            <w:tcW w:type="dxa" w:w="6236"/>
             <w:vAlign w:val="top"/>
           </w:tcPr>
           <w:p>
@@ -3978,7 +3857,7 @@
               <w:rPr>
                 <w:sz w:val="20"/>
               </w:rPr>
-              <w:t>PWA instalable con Service Worker.</w:t>
+              <w:t>Generador de política de privacidad en PDF a partir del RAT.</w:t>
             </w:r>
           </w:p>
         </w:tc>
@@ -3993,13 +3872,13 @@
               <w:rPr>
                 <w:sz w:val="20"/>
               </w:rPr>
-              <w:t>Baja</w:t>
-            </w:r>
-          </w:p>
-        </w:tc>
-        <w:tc>
-          <w:tcPr>
-            <w:tcW w:type="dxa" w:w="1134"/>
+              <w:t>Alta</w:t>
+            </w:r>
+          </w:p>
+        </w:tc>
+        <w:tc>
+          <w:tcPr>
+            <w:tcW w:type="dxa" w:w="1304"/>
             <w:vAlign w:val="top"/>
           </w:tcPr>
           <w:p>
@@ -4008,15 +3887,9 @@
               <w:rPr>
                 <w:sz w:val="20"/>
               </w:rPr>
-              <w:t>5</w:t>
-            </w:r>
-          </w:p>
-        </w:tc>
-        <w:tc>
-          <w:tcPr>
-            <w:tcW w:type="dxa" w:w="1304"/>
-          </w:tcPr>
-          <w:p/>
+              <w:t>8</w:t>
+            </w:r>
+          </w:p>
         </w:tc>
       </w:tr>
       <w:tr>
@@ -4032,13 +3905,13 @@
                 <w:b/>
                 <w:sz w:val="20"/>
               </w:rPr>
-              <w:t>V1-13</w:t>
-            </w:r>
-          </w:p>
-        </w:tc>
-        <w:tc>
-          <w:tcPr>
-            <w:tcW w:type="dxa" w:w="5669"/>
+              <w:t>V1-19</w:t>
+            </w:r>
+          </w:p>
+        </w:tc>
+        <w:tc>
+          <w:tcPr>
+            <w:tcW w:type="dxa" w:w="6236"/>
             <w:vAlign w:val="top"/>
           </w:tcPr>
           <w:p>
@@ -4047,7 +3920,7 @@
               <w:rPr>
                 <w:sz w:val="20"/>
               </w:rPr>
-              <w:t>Exportación XLSX además de CSV.</w:t>
+              <w:t>Tests de seguridad automatizados (OWASP ZAP).</w:t>
             </w:r>
           </w:p>
         </w:tc>
@@ -4062,13 +3935,13 @@
               <w:rPr>
                 <w:sz w:val="20"/>
               </w:rPr>
-              <w:t>Baja</w:t>
-            </w:r>
-          </w:p>
-        </w:tc>
-        <w:tc>
-          <w:tcPr>
-            <w:tcW w:type="dxa" w:w="1134"/>
+              <w:t>Media</w:t>
+            </w:r>
+          </w:p>
+        </w:tc>
+        <w:tc>
+          <w:tcPr>
+            <w:tcW w:type="dxa" w:w="1304"/>
             <w:vAlign w:val="top"/>
           </w:tcPr>
           <w:p>
@@ -4077,15 +3950,9 @@
               <w:rPr>
                 <w:sz w:val="20"/>
               </w:rPr>
-              <w:t>2</w:t>
-            </w:r>
-          </w:p>
-        </w:tc>
-        <w:tc>
-          <w:tcPr>
-            <w:tcW w:type="dxa" w:w="1304"/>
-          </w:tcPr>
-          <w:p/>
+              <w:t>5</w:t>
+            </w:r>
+          </w:p>
         </w:tc>
       </w:tr>
       <w:tr>
@@ -4101,13 +3968,13 @@
                 <w:b/>
                 <w:sz w:val="20"/>
               </w:rPr>
-              <w:t>V1-14</w:t>
-            </w:r>
-          </w:p>
-        </w:tc>
-        <w:tc>
-          <w:tcPr>
-            <w:tcW w:type="dxa" w:w="5669"/>
+              <w:t>V1-20</w:t>
+            </w:r>
+          </w:p>
+        </w:tc>
+        <w:tc>
+          <w:tcPr>
+            <w:tcW w:type="dxa" w:w="6236"/>
             <w:vAlign w:val="top"/>
           </w:tcPr>
           <w:p>
@@ -4116,7 +3983,7 @@
               <w:rPr>
                 <w:sz w:val="20"/>
               </w:rPr>
-              <w:t>API versionada con prefijo /v1/ en rutas.</w:t>
+              <w:t>Logs estructurados en JSON con correlación de request_id.</w:t>
             </w:r>
           </w:p>
         </w:tc>
@@ -4137,7 +4004,7 @@
         </w:tc>
         <w:tc>
           <w:tcPr>
-            <w:tcW w:type="dxa" w:w="1134"/>
+            <w:tcW w:type="dxa" w:w="1304"/>
             <w:vAlign w:val="top"/>
           </w:tcPr>
           <w:p>
@@ -4146,441 +4013,7 @@
               <w:rPr>
                 <w:sz w:val="20"/>
               </w:rPr>
-              <w:t>5</w:t>
-            </w:r>
-          </w:p>
-        </w:tc>
-        <w:tc>
-          <w:tcPr>
-            <w:tcW w:type="dxa" w:w="1304"/>
-          </w:tcPr>
-          <w:p/>
-        </w:tc>
-      </w:tr>
-      <w:tr>
-        <w:tc>
-          <w:tcPr>
-            <w:tcW w:type="dxa" w:w="794"/>
-            <w:vAlign w:val="top"/>
-          </w:tcPr>
-          <w:p>
-            <w:r/>
-            <w:r>
-              <w:rPr>
-                <w:b/>
-                <w:sz w:val="20"/>
-              </w:rPr>
-              <w:t>V1-15</w:t>
-            </w:r>
-          </w:p>
-        </w:tc>
-        <w:tc>
-          <w:tcPr>
-            <w:tcW w:type="dxa" w:w="5669"/>
-            <w:vAlign w:val="top"/>
-          </w:tcPr>
-          <w:p>
-            <w:r/>
-            <w:r>
-              <w:rPr>
-                <w:sz w:val="20"/>
-              </w:rPr>
-              <w:t>Hardening de CORS: lista blanca explícita en lugar de regex amplia.</w:t>
-            </w:r>
-          </w:p>
-        </w:tc>
-        <w:tc>
-          <w:tcPr>
-            <w:tcW w:type="dxa" w:w="1020"/>
-            <w:vAlign w:val="top"/>
-          </w:tcPr>
-          <w:p>
-            <w:r/>
-            <w:r>
-              <w:rPr>
-                <w:sz w:val="20"/>
-              </w:rPr>
-              <w:t>Alta</w:t>
-            </w:r>
-          </w:p>
-        </w:tc>
-        <w:tc>
-          <w:tcPr>
-            <w:tcW w:type="dxa" w:w="1134"/>
-            <w:vAlign w:val="top"/>
-          </w:tcPr>
-          <w:p>
-            <w:r/>
-            <w:r>
-              <w:rPr>
-                <w:sz w:val="20"/>
-              </w:rPr>
               <w:t>3</w:t>
-            </w:r>
-          </w:p>
-        </w:tc>
-        <w:tc>
-          <w:tcPr>
-            <w:tcW w:type="dxa" w:w="1304"/>
-          </w:tcPr>
-          <w:p>
-            <w:r>
-              <w:rPr>
-                <w:sz w:val="20"/>
-              </w:rPr>
-              <w:t>Completada</w:t>
-            </w:r>
-          </w:p>
-        </w:tc>
-      </w:tr>
-      <w:tr>
-        <w:tc>
-          <w:tcPr>
-            <w:tcW w:type="dxa" w:w="794"/>
-            <w:vAlign w:val="top"/>
-          </w:tcPr>
-          <w:p>
-            <w:r/>
-            <w:r>
-              <w:rPr>
-                <w:b/>
-                <w:sz w:val="20"/>
-              </w:rPr>
-              <w:t>V1-16</w:t>
-            </w:r>
-          </w:p>
-        </w:tc>
-        <w:tc>
-          <w:tcPr>
-            <w:tcW w:type="dxa" w:w="5669"/>
-            <w:vAlign w:val="top"/>
-          </w:tcPr>
-          <w:p>
-            <w:r/>
-            <w:r>
-              <w:rPr>
-                <w:sz w:val="20"/>
-              </w:rPr>
-              <w:t>Paginación cursor-based en listados largos.</w:t>
-            </w:r>
-          </w:p>
-        </w:tc>
-        <w:tc>
-          <w:tcPr>
-            <w:tcW w:type="dxa" w:w="1020"/>
-            <w:vAlign w:val="top"/>
-          </w:tcPr>
-          <w:p>
-            <w:r/>
-            <w:r>
-              <w:rPr>
-                <w:sz w:val="20"/>
-              </w:rPr>
-              <w:t>Media</w:t>
-            </w:r>
-          </w:p>
-        </w:tc>
-        <w:tc>
-          <w:tcPr>
-            <w:tcW w:type="dxa" w:w="1134"/>
-            <w:vAlign w:val="top"/>
-          </w:tcPr>
-          <w:p>
-            <w:r/>
-            <w:r>
-              <w:rPr>
-                <w:sz w:val="20"/>
-              </w:rPr>
-              <w:t>3</w:t>
-            </w:r>
-          </w:p>
-        </w:tc>
-        <w:tc>
-          <w:tcPr>
-            <w:tcW w:type="dxa" w:w="1304"/>
-          </w:tcPr>
-          <w:p/>
-        </w:tc>
-      </w:tr>
-      <w:tr>
-        <w:tc>
-          <w:tcPr>
-            <w:tcW w:type="dxa" w:w="794"/>
-            <w:vAlign w:val="top"/>
-          </w:tcPr>
-          <w:p>
-            <w:r/>
-            <w:r>
-              <w:rPr>
-                <w:b/>
-                <w:sz w:val="20"/>
-              </w:rPr>
-              <w:t>V1-17</w:t>
-            </w:r>
-          </w:p>
-        </w:tc>
-        <w:tc>
-          <w:tcPr>
-            <w:tcW w:type="dxa" w:w="5669"/>
-            <w:vAlign w:val="top"/>
-          </w:tcPr>
-          <w:p>
-            <w:r/>
-            <w:r>
-              <w:rPr>
-                <w:sz w:val="20"/>
-              </w:rPr>
-              <w:t>Plantillas de correo configurables para notificaciones.</w:t>
-            </w:r>
-          </w:p>
-        </w:tc>
-        <w:tc>
-          <w:tcPr>
-            <w:tcW w:type="dxa" w:w="1020"/>
-            <w:vAlign w:val="top"/>
-          </w:tcPr>
-          <w:p>
-            <w:r/>
-            <w:r>
-              <w:rPr>
-                <w:sz w:val="20"/>
-              </w:rPr>
-              <w:t>Media</w:t>
-            </w:r>
-          </w:p>
-        </w:tc>
-        <w:tc>
-          <w:tcPr>
-            <w:tcW w:type="dxa" w:w="1134"/>
-            <w:vAlign w:val="top"/>
-          </w:tcPr>
-          <w:p>
-            <w:r/>
-            <w:r>
-              <w:rPr>
-                <w:sz w:val="20"/>
-              </w:rPr>
-              <w:t>5</w:t>
-            </w:r>
-          </w:p>
-        </w:tc>
-        <w:tc>
-          <w:tcPr>
-            <w:tcW w:type="dxa" w:w="1304"/>
-          </w:tcPr>
-          <w:p/>
-        </w:tc>
-      </w:tr>
-      <w:tr>
-        <w:tc>
-          <w:tcPr>
-            <w:tcW w:type="dxa" w:w="794"/>
-            <w:vAlign w:val="top"/>
-          </w:tcPr>
-          <w:p>
-            <w:r/>
-            <w:r>
-              <w:rPr>
-                <w:b/>
-                <w:sz w:val="20"/>
-              </w:rPr>
-              <w:t>V1-18</w:t>
-            </w:r>
-          </w:p>
-        </w:tc>
-        <w:tc>
-          <w:tcPr>
-            <w:tcW w:type="dxa" w:w="5669"/>
-            <w:vAlign w:val="top"/>
-          </w:tcPr>
-          <w:p>
-            <w:r/>
-            <w:r>
-              <w:rPr>
-                <w:sz w:val="20"/>
-              </w:rPr>
-              <w:t>Generador de política de privacidad en PDF a partir del RAT.</w:t>
-            </w:r>
-          </w:p>
-        </w:tc>
-        <w:tc>
-          <w:tcPr>
-            <w:tcW w:type="dxa" w:w="1020"/>
-            <w:vAlign w:val="top"/>
-          </w:tcPr>
-          <w:p>
-            <w:r/>
-            <w:r>
-              <w:rPr>
-                <w:sz w:val="20"/>
-              </w:rPr>
-              <w:t>Alta</w:t>
-            </w:r>
-          </w:p>
-        </w:tc>
-        <w:tc>
-          <w:tcPr>
-            <w:tcW w:type="dxa" w:w="1134"/>
-            <w:vAlign w:val="top"/>
-          </w:tcPr>
-          <w:p>
-            <w:r/>
-            <w:r>
-              <w:rPr>
-                <w:sz w:val="20"/>
-              </w:rPr>
-              <w:t>8</w:t>
-            </w:r>
-          </w:p>
-        </w:tc>
-        <w:tc>
-          <w:tcPr>
-            <w:tcW w:type="dxa" w:w="1304"/>
-          </w:tcPr>
-          <w:p/>
-        </w:tc>
-      </w:tr>
-      <w:tr>
-        <w:tc>
-          <w:tcPr>
-            <w:tcW w:type="dxa" w:w="794"/>
-            <w:vAlign w:val="top"/>
-          </w:tcPr>
-          <w:p>
-            <w:r/>
-            <w:r>
-              <w:rPr>
-                <w:b/>
-                <w:sz w:val="20"/>
-              </w:rPr>
-              <w:t>V1-19</w:t>
-            </w:r>
-          </w:p>
-        </w:tc>
-        <w:tc>
-          <w:tcPr>
-            <w:tcW w:type="dxa" w:w="5669"/>
-            <w:vAlign w:val="top"/>
-          </w:tcPr>
-          <w:p>
-            <w:r/>
-            <w:r>
-              <w:rPr>
-                <w:sz w:val="20"/>
-              </w:rPr>
-              <w:t>Tests de seguridad automatizados (OWASP ZAP).</w:t>
-            </w:r>
-          </w:p>
-        </w:tc>
-        <w:tc>
-          <w:tcPr>
-            <w:tcW w:type="dxa" w:w="1020"/>
-            <w:vAlign w:val="top"/>
-          </w:tcPr>
-          <w:p>
-            <w:r/>
-            <w:r>
-              <w:rPr>
-                <w:sz w:val="20"/>
-              </w:rPr>
-              <w:t>Media</w:t>
-            </w:r>
-          </w:p>
-        </w:tc>
-        <w:tc>
-          <w:tcPr>
-            <w:tcW w:type="dxa" w:w="1134"/>
-            <w:vAlign w:val="top"/>
-          </w:tcPr>
-          <w:p>
-            <w:r/>
-            <w:r>
-              <w:rPr>
-                <w:sz w:val="20"/>
-              </w:rPr>
-              <w:t>5</w:t>
-            </w:r>
-          </w:p>
-        </w:tc>
-        <w:tc>
-          <w:tcPr>
-            <w:tcW w:type="dxa" w:w="1304"/>
-          </w:tcPr>
-          <w:p/>
-        </w:tc>
-      </w:tr>
-      <w:tr>
-        <w:tc>
-          <w:tcPr>
-            <w:tcW w:type="dxa" w:w="794"/>
-            <w:vAlign w:val="top"/>
-          </w:tcPr>
-          <w:p>
-            <w:r/>
-            <w:r>
-              <w:rPr>
-                <w:b/>
-                <w:sz w:val="20"/>
-              </w:rPr>
-              <w:t>V1-20</w:t>
-            </w:r>
-          </w:p>
-        </w:tc>
-        <w:tc>
-          <w:tcPr>
-            <w:tcW w:type="dxa" w:w="5669"/>
-            <w:vAlign w:val="top"/>
-          </w:tcPr>
-          <w:p>
-            <w:r/>
-            <w:r>
-              <w:rPr>
-                <w:sz w:val="20"/>
-              </w:rPr>
-              <w:t>Logs estructurados en JSON con correlación de request_id.</w:t>
-            </w:r>
-          </w:p>
-        </w:tc>
-        <w:tc>
-          <w:tcPr>
-            <w:tcW w:type="dxa" w:w="1020"/>
-            <w:vAlign w:val="top"/>
-          </w:tcPr>
-          <w:p>
-            <w:r/>
-            <w:r>
-              <w:rPr>
-                <w:sz w:val="20"/>
-              </w:rPr>
-              <w:t>Media</w:t>
-            </w:r>
-          </w:p>
-        </w:tc>
-        <w:tc>
-          <w:tcPr>
-            <w:tcW w:type="dxa" w:w="1134"/>
-            <w:vAlign w:val="top"/>
-          </w:tcPr>
-          <w:p>
-            <w:r/>
-            <w:r>
-              <w:rPr>
-                <w:sz w:val="20"/>
-              </w:rPr>
-              <w:t>3</w:t>
-            </w:r>
-          </w:p>
-        </w:tc>
-        <w:tc>
-          <w:tcPr>
-            <w:tcW w:type="dxa" w:w="1304"/>
-          </w:tcPr>
-          <w:p>
-            <w:r>
-              <w:rPr>
-                <w:sz w:val="20"/>
-              </w:rPr>
-              <w:t>Completada</w:t>
             </w:r>
           </w:p>
         </w:tc>
@@ -4610,11 +4043,10 @@
         <w:tblLook w:firstColumn="1" w:firstRow="1" w:lastColumn="0" w:lastRow="0" w:noHBand="0" w:noVBand="1" w:val="04A0"/>
       </w:tblPr>
       <w:tblGrid>
-        <w:gridCol w:w="1994"/>
-        <w:gridCol w:w="1994"/>
-        <w:gridCol w:w="1994"/>
-        <w:gridCol w:w="1994"/>
-        <w:gridCol w:w="1994"/>
+        <w:gridCol w:w="2493"/>
+        <w:gridCol w:w="2493"/>
+        <w:gridCol w:w="2493"/>
+        <w:gridCol w:w="2493"/>
       </w:tblGrid>
       <w:tr>
         <w:tc>
@@ -4637,7 +4069,7 @@
         </w:tc>
         <w:tc>
           <w:tcPr>
-            <w:tcW w:type="dxa" w:w="5386"/>
+            <w:tcW w:type="dxa" w:w="6236"/>
             <w:shd w:val="clear" w:color="auto" w:fill="D9E2F3"/>
             <w:vAlign w:val="center"/>
           </w:tcPr>
@@ -4673,24 +4105,6 @@
         </w:tc>
         <w:tc>
           <w:tcPr>
-            <w:tcW w:type="dxa" w:w="1020"/>
-            <w:shd w:val="clear" w:color="auto" w:fill="D9E2F3"/>
-            <w:vAlign w:val="center"/>
-          </w:tcPr>
-          <w:p>
-            <w:r/>
-            <w:r>
-              <w:rPr>
-                <w:b/>
-                <w:color w:val="1F497D"/>
-                <w:sz w:val="20"/>
-              </w:rPr>
-              <w:t>Tamaño</w:t>
-            </w:r>
-          </w:p>
-        </w:tc>
-        <w:tc>
-          <w:tcPr>
             <w:tcW w:type="dxa" w:w="1304"/>
             <w:shd w:val="clear" w:color="auto" w:fill="D9E2F3"/>
             <w:vAlign w:val="center"/>
@@ -4703,7 +4117,7 @@
                 <w:color w:val="1F497D"/>
                 <w:sz w:val="20"/>
               </w:rPr>
-              <w:t>Estado</w:t>
+              <w:t>Tamaño</w:t>
             </w:r>
           </w:p>
         </w:tc>
@@ -4727,7 +4141,7 @@
         </w:tc>
         <w:tc>
           <w:tcPr>
-            <w:tcW w:type="dxa" w:w="5386"/>
+            <w:tcW w:type="dxa" w:w="6236"/>
             <w:vAlign w:val="top"/>
           </w:tcPr>
           <w:p>
@@ -4757,6 +4171,54 @@
         </w:tc>
         <w:tc>
           <w:tcPr>
+            <w:tcW w:type="dxa" w:w="1304"/>
+            <w:vAlign w:val="top"/>
+          </w:tcPr>
+          <w:p>
+            <w:r/>
+            <w:r>
+              <w:rPr>
+                <w:sz w:val="20"/>
+              </w:rPr>
+              <w:t>8</w:t>
+            </w:r>
+          </w:p>
+        </w:tc>
+      </w:tr>
+      <w:tr>
+        <w:tc>
+          <w:tcPr>
+            <w:tcW w:type="dxa" w:w="794"/>
+            <w:vAlign w:val="top"/>
+          </w:tcPr>
+          <w:p>
+            <w:r/>
+            <w:r>
+              <w:rPr>
+                <w:b/>
+                <w:sz w:val="20"/>
+              </w:rPr>
+              <w:t>V2-02</w:t>
+            </w:r>
+          </w:p>
+        </w:tc>
+        <w:tc>
+          <w:tcPr>
+            <w:tcW w:type="dxa" w:w="6236"/>
+            <w:vAlign w:val="top"/>
+          </w:tcPr>
+          <w:p>
+            <w:r/>
+            <w:r>
+              <w:rPr>
+                <w:sz w:val="20"/>
+              </w:rPr>
+              <w:t>Multi-tenancy con base de datos por tenant (no solo columna company_id).</w:t>
+            </w:r>
+          </w:p>
+        </w:tc>
+        <w:tc>
+          <w:tcPr>
             <w:tcW w:type="dxa" w:w="1020"/>
             <w:vAlign w:val="top"/>
           </w:tcPr>
@@ -4766,15 +4228,24 @@
               <w:rPr>
                 <w:sz w:val="20"/>
               </w:rPr>
-              <w:t>8</w:t>
+              <w:t>Media</w:t>
             </w:r>
           </w:p>
         </w:tc>
         <w:tc>
           <w:tcPr>
             <w:tcW w:type="dxa" w:w="1304"/>
-          </w:tcPr>
-          <w:p/>
+            <w:vAlign w:val="top"/>
+          </w:tcPr>
+          <w:p>
+            <w:r/>
+            <w:r>
+              <w:rPr>
+                <w:sz w:val="20"/>
+              </w:rPr>
+              <w:t>13</w:t>
+            </w:r>
+          </w:p>
         </w:tc>
       </w:tr>
       <w:tr>
@@ -4790,13 +4261,13 @@
                 <w:b/>
                 <w:sz w:val="20"/>
               </w:rPr>
-              <w:t>V2-02</w:t>
-            </w:r>
-          </w:p>
-        </w:tc>
-        <w:tc>
-          <w:tcPr>
-            <w:tcW w:type="dxa" w:w="5386"/>
+              <w:t>V2-03</w:t>
+            </w:r>
+          </w:p>
+        </w:tc>
+        <w:tc>
+          <w:tcPr>
+            <w:tcW w:type="dxa" w:w="6236"/>
             <w:vAlign w:val="top"/>
           </w:tcPr>
           <w:p>
@@ -4805,7 +4276,7 @@
               <w:rPr>
                 <w:sz w:val="20"/>
               </w:rPr>
-              <w:t>Multi-tenancy con base de datos por tenant (no solo columna company_id).</w:t>
+              <w:t>API pública con autenticación por API key para integraciones.</w:t>
             </w:r>
           </w:p>
         </w:tc>
@@ -4820,7 +4291,55 @@
               <w:rPr>
                 <w:sz w:val="20"/>
               </w:rPr>
-              <w:t>Media</w:t>
+              <w:t>Alta</w:t>
+            </w:r>
+          </w:p>
+        </w:tc>
+        <w:tc>
+          <w:tcPr>
+            <w:tcW w:type="dxa" w:w="1304"/>
+            <w:vAlign w:val="top"/>
+          </w:tcPr>
+          <w:p>
+            <w:r/>
+            <w:r>
+              <w:rPr>
+                <w:sz w:val="20"/>
+              </w:rPr>
+              <w:t>13</w:t>
+            </w:r>
+          </w:p>
+        </w:tc>
+      </w:tr>
+      <w:tr>
+        <w:tc>
+          <w:tcPr>
+            <w:tcW w:type="dxa" w:w="794"/>
+            <w:vAlign w:val="top"/>
+          </w:tcPr>
+          <w:p>
+            <w:r/>
+            <w:r>
+              <w:rPr>
+                <w:b/>
+                <w:sz w:val="20"/>
+              </w:rPr>
+              <w:t>V2-04</w:t>
+            </w:r>
+          </w:p>
+        </w:tc>
+        <w:tc>
+          <w:tcPr>
+            <w:tcW w:type="dxa" w:w="6236"/>
+            <w:vAlign w:val="top"/>
+          </w:tcPr>
+          <w:p>
+            <w:r/>
+            <w:r>
+              <w:rPr>
+                <w:sz w:val="20"/>
+              </w:rPr>
+              <w:t>Webhooks hacia sistemas externos (cambios de RAT, brechas, ARCO).</w:t>
             </w:r>
           </w:p>
         </w:tc>
@@ -4835,15 +4354,24 @@
               <w:rPr>
                 <w:sz w:val="20"/>
               </w:rPr>
-              <w:t>13</w:t>
+              <w:t>Media</w:t>
             </w:r>
           </w:p>
         </w:tc>
         <w:tc>
           <w:tcPr>
             <w:tcW w:type="dxa" w:w="1304"/>
-          </w:tcPr>
-          <w:p/>
+            <w:vAlign w:val="top"/>
+          </w:tcPr>
+          <w:p>
+            <w:r/>
+            <w:r>
+              <w:rPr>
+                <w:sz w:val="20"/>
+              </w:rPr>
+              <w:t>8</w:t>
+            </w:r>
+          </w:p>
         </w:tc>
       </w:tr>
       <w:tr>
@@ -4859,13 +4387,13 @@
                 <w:b/>
                 <w:sz w:val="20"/>
               </w:rPr>
-              <w:t>V2-03</w:t>
-            </w:r>
-          </w:p>
-        </w:tc>
-        <w:tc>
-          <w:tcPr>
-            <w:tcW w:type="dxa" w:w="5386"/>
+              <w:t>V2-05</w:t>
+            </w:r>
+          </w:p>
+        </w:tc>
+        <w:tc>
+          <w:tcPr>
+            <w:tcW w:type="dxa" w:w="6236"/>
             <w:vAlign w:val="top"/>
           </w:tcPr>
           <w:p>
@@ -4874,7 +4402,7 @@
               <w:rPr>
                 <w:sz w:val="20"/>
               </w:rPr>
-              <w:t>API pública con autenticación por API key para integraciones.</w:t>
+              <w:t>Marketplace de plantillas de RAT (varios idiomas y países).</w:t>
             </w:r>
           </w:p>
         </w:tc>
@@ -4889,7 +4417,55 @@
               <w:rPr>
                 <w:sz w:val="20"/>
               </w:rPr>
-              <w:t>Alta</w:t>
+              <w:t>Baja</w:t>
+            </w:r>
+          </w:p>
+        </w:tc>
+        <w:tc>
+          <w:tcPr>
+            <w:tcW w:type="dxa" w:w="1304"/>
+            <w:vAlign w:val="top"/>
+          </w:tcPr>
+          <w:p>
+            <w:r/>
+            <w:r>
+              <w:rPr>
+                <w:sz w:val="20"/>
+              </w:rPr>
+              <w:t>13</w:t>
+            </w:r>
+          </w:p>
+        </w:tc>
+      </w:tr>
+      <w:tr>
+        <w:tc>
+          <w:tcPr>
+            <w:tcW w:type="dxa" w:w="794"/>
+            <w:vAlign w:val="top"/>
+          </w:tcPr>
+          <w:p>
+            <w:r/>
+            <w:r>
+              <w:rPr>
+                <w:b/>
+                <w:sz w:val="20"/>
+              </w:rPr>
+              <w:t>V2-06</w:t>
+            </w:r>
+          </w:p>
+        </w:tc>
+        <w:tc>
+          <w:tcPr>
+            <w:tcW w:type="dxa" w:w="6236"/>
+            <w:vAlign w:val="top"/>
+          </w:tcPr>
+          <w:p>
+            <w:r/>
+            <w:r>
+              <w:rPr>
+                <w:sz w:val="20"/>
+              </w:rPr>
+              <w:t>Generador de cláusulas de privacidad contractual (legal).</w:t>
             </w:r>
           </w:p>
         </w:tc>
@@ -4904,15 +4480,24 @@
               <w:rPr>
                 <w:sz w:val="20"/>
               </w:rPr>
+              <w:t>Media</w:t>
+            </w:r>
+          </w:p>
+        </w:tc>
+        <w:tc>
+          <w:tcPr>
+            <w:tcW w:type="dxa" w:w="1304"/>
+            <w:vAlign w:val="top"/>
+          </w:tcPr>
+          <w:p>
+            <w:r/>
+            <w:r>
+              <w:rPr>
+                <w:sz w:val="20"/>
+              </w:rPr>
               <w:t>13</w:t>
             </w:r>
           </w:p>
-        </w:tc>
-        <w:tc>
-          <w:tcPr>
-            <w:tcW w:type="dxa" w:w="1304"/>
-          </w:tcPr>
-          <w:p/>
         </w:tc>
       </w:tr>
       <w:tr>
@@ -4928,13 +4513,13 @@
                 <w:b/>
                 <w:sz w:val="20"/>
               </w:rPr>
-              <w:t>V2-04</w:t>
-            </w:r>
-          </w:p>
-        </w:tc>
-        <w:tc>
-          <w:tcPr>
-            <w:tcW w:type="dxa" w:w="5386"/>
+              <w:t>V2-07</w:t>
+            </w:r>
+          </w:p>
+        </w:tc>
+        <w:tc>
+          <w:tcPr>
+            <w:tcW w:type="dxa" w:w="6236"/>
             <w:vAlign w:val="top"/>
           </w:tcPr>
           <w:p>
@@ -4943,7 +4528,7 @@
               <w:rPr>
                 <w:sz w:val="20"/>
               </w:rPr>
-              <w:t>Webhooks hacia sistemas externos (cambios de RAT, brechas, ARCO).</w:t>
+              <w:t>Conector con APDC para envío directo de evidencias (cuando exista API).</w:t>
             </w:r>
           </w:p>
         </w:tc>
@@ -4958,7 +4543,55 @@
               <w:rPr>
                 <w:sz w:val="20"/>
               </w:rPr>
-              <w:t>Media</w:t>
+              <w:t>Alta</w:t>
+            </w:r>
+          </w:p>
+        </w:tc>
+        <w:tc>
+          <w:tcPr>
+            <w:tcW w:type="dxa" w:w="1304"/>
+            <w:vAlign w:val="top"/>
+          </w:tcPr>
+          <w:p>
+            <w:r/>
+            <w:r>
+              <w:rPr>
+                <w:sz w:val="20"/>
+              </w:rPr>
+              <w:t>13</w:t>
+            </w:r>
+          </w:p>
+        </w:tc>
+      </w:tr>
+      <w:tr>
+        <w:tc>
+          <w:tcPr>
+            <w:tcW w:type="dxa" w:w="794"/>
+            <w:vAlign w:val="top"/>
+          </w:tcPr>
+          <w:p>
+            <w:r/>
+            <w:r>
+              <w:rPr>
+                <w:b/>
+                <w:sz w:val="20"/>
+              </w:rPr>
+              <w:t>V2-08</w:t>
+            </w:r>
+          </w:p>
+        </w:tc>
+        <w:tc>
+          <w:tcPr>
+            <w:tcW w:type="dxa" w:w="6236"/>
+            <w:vAlign w:val="top"/>
+          </w:tcPr>
+          <w:p>
+            <w:r/>
+            <w:r>
+              <w:rPr>
+                <w:sz w:val="20"/>
+              </w:rPr>
+              <w:t>Asistente IA con fine-tuning del modelo para la Ley 21.719 chilena.</w:t>
             </w:r>
           </w:p>
         </w:tc>
@@ -4973,15 +4606,24 @@
               <w:rPr>
                 <w:sz w:val="20"/>
               </w:rPr>
-              <w:t>8</w:t>
+              <w:t>Baja</w:t>
             </w:r>
           </w:p>
         </w:tc>
         <w:tc>
           <w:tcPr>
             <w:tcW w:type="dxa" w:w="1304"/>
-          </w:tcPr>
-          <w:p/>
+            <w:vAlign w:val="top"/>
+          </w:tcPr>
+          <w:p>
+            <w:r/>
+            <w:r>
+              <w:rPr>
+                <w:sz w:val="20"/>
+              </w:rPr>
+              <w:t>13</w:t>
+            </w:r>
+          </w:p>
         </w:tc>
       </w:tr>
       <w:tr>
@@ -4997,13 +4639,13 @@
                 <w:b/>
                 <w:sz w:val="20"/>
               </w:rPr>
-              <w:t>V2-05</w:t>
-            </w:r>
-          </w:p>
-        </w:tc>
-        <w:tc>
-          <w:tcPr>
-            <w:tcW w:type="dxa" w:w="5386"/>
+              <w:t>V2-09</w:t>
+            </w:r>
+          </w:p>
+        </w:tc>
+        <w:tc>
+          <w:tcPr>
+            <w:tcW w:type="dxa" w:w="6236"/>
             <w:vAlign w:val="top"/>
           </w:tcPr>
           <w:p>
@@ -5012,7 +4654,7 @@
               <w:rPr>
                 <w:sz w:val="20"/>
               </w:rPr>
-              <w:t>Marketplace de plantillas de RAT (varios idiomas y países).</w:t>
+              <w:t>Generador de cláusulas contractuales con encargos (Art. 14 quáter).</w:t>
             </w:r>
           </w:p>
         </w:tc>
@@ -5027,7 +4669,55 @@
               <w:rPr>
                 <w:sz w:val="20"/>
               </w:rPr>
-              <w:t>Baja</w:t>
+              <w:t>Media</w:t>
+            </w:r>
+          </w:p>
+        </w:tc>
+        <w:tc>
+          <w:tcPr>
+            <w:tcW w:type="dxa" w:w="1304"/>
+            <w:vAlign w:val="top"/>
+          </w:tcPr>
+          <w:p>
+            <w:r/>
+            <w:r>
+              <w:rPr>
+                <w:sz w:val="20"/>
+              </w:rPr>
+              <w:t>8</w:t>
+            </w:r>
+          </w:p>
+        </w:tc>
+      </w:tr>
+      <w:tr>
+        <w:tc>
+          <w:tcPr>
+            <w:tcW w:type="dxa" w:w="794"/>
+            <w:vAlign w:val="top"/>
+          </w:tcPr>
+          <w:p>
+            <w:r/>
+            <w:r>
+              <w:rPr>
+                <w:b/>
+                <w:sz w:val="20"/>
+              </w:rPr>
+              <w:t>V2-10</w:t>
+            </w:r>
+          </w:p>
+        </w:tc>
+        <w:tc>
+          <w:tcPr>
+            <w:tcW w:type="dxa" w:w="6236"/>
+            <w:vAlign w:val="top"/>
+          </w:tcPr>
+          <w:p>
+            <w:r/>
+            <w:r>
+              <w:rPr>
+                <w:sz w:val="20"/>
+              </w:rPr>
+              <w:t>Sistema de firmas digitales para aprobación de RAT (eIDAS o equivalente).</w:t>
             </w:r>
           </w:p>
         </w:tc>
@@ -5042,15 +4732,24 @@
               <w:rPr>
                 <w:sz w:val="20"/>
               </w:rPr>
+              <w:t>Media</w:t>
+            </w:r>
+          </w:p>
+        </w:tc>
+        <w:tc>
+          <w:tcPr>
+            <w:tcW w:type="dxa" w:w="1304"/>
+            <w:vAlign w:val="top"/>
+          </w:tcPr>
+          <w:p>
+            <w:r/>
+            <w:r>
+              <w:rPr>
+                <w:sz w:val="20"/>
+              </w:rPr>
               <w:t>13</w:t>
             </w:r>
           </w:p>
-        </w:tc>
-        <w:tc>
-          <w:tcPr>
-            <w:tcW w:type="dxa" w:w="1304"/>
-          </w:tcPr>
-          <w:p/>
         </w:tc>
       </w:tr>
       <w:tr>
@@ -5066,13 +4765,13 @@
                 <w:b/>
                 <w:sz w:val="20"/>
               </w:rPr>
-              <w:t>V2-06</w:t>
-            </w:r>
-          </w:p>
-        </w:tc>
-        <w:tc>
-          <w:tcPr>
-            <w:tcW w:type="dxa" w:w="5386"/>
+              <w:t>V2-11</w:t>
+            </w:r>
+          </w:p>
+        </w:tc>
+        <w:tc>
+          <w:tcPr>
+            <w:tcW w:type="dxa" w:w="6236"/>
             <w:vAlign w:val="top"/>
           </w:tcPr>
           <w:p>
@@ -5081,7 +4780,7 @@
               <w:rPr>
                 <w:sz w:val="20"/>
               </w:rPr>
-              <w:t>Generador de cláusulas de privacidad contractual (legal).</w:t>
+              <w:t>Auditoría inmutable (blockchain privada o WORM storage).</w:t>
             </w:r>
           </w:p>
         </w:tc>
@@ -5096,7 +4795,55 @@
               <w:rPr>
                 <w:sz w:val="20"/>
               </w:rPr>
-              <w:t>Media</w:t>
+              <w:t>Baja</w:t>
+            </w:r>
+          </w:p>
+        </w:tc>
+        <w:tc>
+          <w:tcPr>
+            <w:tcW w:type="dxa" w:w="1304"/>
+            <w:vAlign w:val="top"/>
+          </w:tcPr>
+          <w:p>
+            <w:r/>
+            <w:r>
+              <w:rPr>
+                <w:sz w:val="20"/>
+              </w:rPr>
+              <w:t>13</w:t>
+            </w:r>
+          </w:p>
+        </w:tc>
+      </w:tr>
+      <w:tr>
+        <w:tc>
+          <w:tcPr>
+            <w:tcW w:type="dxa" w:w="794"/>
+            <w:vAlign w:val="top"/>
+          </w:tcPr>
+          <w:p>
+            <w:r/>
+            <w:r>
+              <w:rPr>
+                <w:b/>
+                <w:sz w:val="20"/>
+              </w:rPr>
+              <w:t>V2-12</w:t>
+            </w:r>
+          </w:p>
+        </w:tc>
+        <w:tc>
+          <w:tcPr>
+            <w:tcW w:type="dxa" w:w="6236"/>
+            <w:vAlign w:val="top"/>
+          </w:tcPr>
+          <w:p>
+            <w:r/>
+            <w:r>
+              <w:rPr>
+                <w:sz w:val="20"/>
+              </w:rPr>
+              <w:t>Modo 'multipais' con soporte para LGPD, GDPR, CCPA.</w:t>
             </w:r>
           </w:p>
         </w:tc>
@@ -5111,15 +4858,24 @@
               <w:rPr>
                 <w:sz w:val="20"/>
               </w:rPr>
-              <w:t>13</w:t>
+              <w:t>Baja</w:t>
             </w:r>
           </w:p>
         </w:tc>
         <w:tc>
           <w:tcPr>
             <w:tcW w:type="dxa" w:w="1304"/>
-          </w:tcPr>
-          <w:p/>
+            <w:vAlign w:val="top"/>
+          </w:tcPr>
+          <w:p>
+            <w:r/>
+            <w:r>
+              <w:rPr>
+                <w:sz w:val="20"/>
+              </w:rPr>
+              <w:t>21</w:t>
+            </w:r>
+          </w:p>
         </w:tc>
       </w:tr>
       <w:tr>
@@ -5135,13 +4891,13 @@
                 <w:b/>
                 <w:sz w:val="20"/>
               </w:rPr>
-              <w:t>V2-07</w:t>
-            </w:r>
-          </w:p>
-        </w:tc>
-        <w:tc>
-          <w:tcPr>
-            <w:tcW w:type="dxa" w:w="5386"/>
+              <w:t>V2-13</w:t>
+            </w:r>
+          </w:p>
+        </w:tc>
+        <w:tc>
+          <w:tcPr>
+            <w:tcW w:type="dxa" w:w="6236"/>
             <w:vAlign w:val="top"/>
           </w:tcPr>
           <w:p>
@@ -5150,7 +4906,7 @@
               <w:rPr>
                 <w:sz w:val="20"/>
               </w:rPr>
-              <w:t>Conector con APDC para envío directo de evidencias (cuando exista API).</w:t>
+              <w:t>Generador de EIPD automático con recomendaciones de la IA.</w:t>
             </w:r>
           </w:p>
         </w:tc>
@@ -5165,7 +4921,55 @@
               <w:rPr>
                 <w:sz w:val="20"/>
               </w:rPr>
-              <w:t>Alta</w:t>
+              <w:t>Media</w:t>
+            </w:r>
+          </w:p>
+        </w:tc>
+        <w:tc>
+          <w:tcPr>
+            <w:tcW w:type="dxa" w:w="1304"/>
+            <w:vAlign w:val="top"/>
+          </w:tcPr>
+          <w:p>
+            <w:r/>
+            <w:r>
+              <w:rPr>
+                <w:sz w:val="20"/>
+              </w:rPr>
+              <w:t>8</w:t>
+            </w:r>
+          </w:p>
+        </w:tc>
+      </w:tr>
+      <w:tr>
+        <w:tc>
+          <w:tcPr>
+            <w:tcW w:type="dxa" w:w="794"/>
+            <w:vAlign w:val="top"/>
+          </w:tcPr>
+          <w:p>
+            <w:r/>
+            <w:r>
+              <w:rPr>
+                <w:b/>
+                <w:sz w:val="20"/>
+              </w:rPr>
+              <w:t>V2-14</w:t>
+            </w:r>
+          </w:p>
+        </w:tc>
+        <w:tc>
+          <w:tcPr>
+            <w:tcW w:type="dxa" w:w="6236"/>
+            <w:vAlign w:val="top"/>
+          </w:tcPr>
+          <w:p>
+            <w:r/>
+            <w:r>
+              <w:rPr>
+                <w:sz w:val="20"/>
+              </w:rPr>
+              <w:t>Reportes avanzados: heatmap, mapas de calor de datos por zona geográfica.</w:t>
             </w:r>
           </w:p>
         </w:tc>
@@ -5180,498 +4984,24 @@
               <w:rPr>
                 <w:sz w:val="20"/>
               </w:rPr>
+              <w:t>Baja</w:t>
+            </w:r>
+          </w:p>
+        </w:tc>
+        <w:tc>
+          <w:tcPr>
+            <w:tcW w:type="dxa" w:w="1304"/>
+            <w:vAlign w:val="top"/>
+          </w:tcPr>
+          <w:p>
+            <w:r/>
+            <w:r>
+              <w:rPr>
+                <w:sz w:val="20"/>
+              </w:rPr>
               <w:t>13</w:t>
             </w:r>
           </w:p>
-        </w:tc>
-        <w:tc>
-          <w:tcPr>
-            <w:tcW w:type="dxa" w:w="1304"/>
-          </w:tcPr>
-          <w:p/>
-        </w:tc>
-      </w:tr>
-      <w:tr>
-        <w:tc>
-          <w:tcPr>
-            <w:tcW w:type="dxa" w:w="794"/>
-            <w:vAlign w:val="top"/>
-          </w:tcPr>
-          <w:p>
-            <w:r/>
-            <w:r>
-              <w:rPr>
-                <w:b/>
-                <w:sz w:val="20"/>
-              </w:rPr>
-              <w:t>V2-08</w:t>
-            </w:r>
-          </w:p>
-        </w:tc>
-        <w:tc>
-          <w:tcPr>
-            <w:tcW w:type="dxa" w:w="5386"/>
-            <w:vAlign w:val="top"/>
-          </w:tcPr>
-          <w:p>
-            <w:r/>
-            <w:r>
-              <w:rPr>
-                <w:sz w:val="20"/>
-              </w:rPr>
-              <w:t>Asistente IA con fine-tuning del modelo para la Ley 21.719 chilena.</w:t>
-            </w:r>
-          </w:p>
-        </w:tc>
-        <w:tc>
-          <w:tcPr>
-            <w:tcW w:type="dxa" w:w="1020"/>
-            <w:vAlign w:val="top"/>
-          </w:tcPr>
-          <w:p>
-            <w:r/>
-            <w:r>
-              <w:rPr>
-                <w:sz w:val="20"/>
-              </w:rPr>
-              <w:t>Baja</w:t>
-            </w:r>
-          </w:p>
-        </w:tc>
-        <w:tc>
-          <w:tcPr>
-            <w:tcW w:type="dxa" w:w="1020"/>
-            <w:vAlign w:val="top"/>
-          </w:tcPr>
-          <w:p>
-            <w:r/>
-            <w:r>
-              <w:rPr>
-                <w:sz w:val="20"/>
-              </w:rPr>
-              <w:t>13</w:t>
-            </w:r>
-          </w:p>
-        </w:tc>
-        <w:tc>
-          <w:tcPr>
-            <w:tcW w:type="dxa" w:w="1304"/>
-          </w:tcPr>
-          <w:p/>
-        </w:tc>
-      </w:tr>
-      <w:tr>
-        <w:tc>
-          <w:tcPr>
-            <w:tcW w:type="dxa" w:w="794"/>
-            <w:vAlign w:val="top"/>
-          </w:tcPr>
-          <w:p>
-            <w:r/>
-            <w:r>
-              <w:rPr>
-                <w:b/>
-                <w:sz w:val="20"/>
-              </w:rPr>
-              <w:t>V2-09</w:t>
-            </w:r>
-          </w:p>
-        </w:tc>
-        <w:tc>
-          <w:tcPr>
-            <w:tcW w:type="dxa" w:w="5386"/>
-            <w:vAlign w:val="top"/>
-          </w:tcPr>
-          <w:p>
-            <w:r/>
-            <w:r>
-              <w:rPr>
-                <w:sz w:val="20"/>
-              </w:rPr>
-              <w:t>Generador de cláusulas contractuales con encargos (Art. 14 quáter).</w:t>
-            </w:r>
-          </w:p>
-        </w:tc>
-        <w:tc>
-          <w:tcPr>
-            <w:tcW w:type="dxa" w:w="1020"/>
-            <w:vAlign w:val="top"/>
-          </w:tcPr>
-          <w:p>
-            <w:r/>
-            <w:r>
-              <w:rPr>
-                <w:sz w:val="20"/>
-              </w:rPr>
-              <w:t>Media</w:t>
-            </w:r>
-          </w:p>
-        </w:tc>
-        <w:tc>
-          <w:tcPr>
-            <w:tcW w:type="dxa" w:w="1020"/>
-            <w:vAlign w:val="top"/>
-          </w:tcPr>
-          <w:p>
-            <w:r/>
-            <w:r>
-              <w:rPr>
-                <w:sz w:val="20"/>
-              </w:rPr>
-              <w:t>8</w:t>
-            </w:r>
-          </w:p>
-        </w:tc>
-        <w:tc>
-          <w:tcPr>
-            <w:tcW w:type="dxa" w:w="1304"/>
-          </w:tcPr>
-          <w:p/>
-        </w:tc>
-      </w:tr>
-      <w:tr>
-        <w:tc>
-          <w:tcPr>
-            <w:tcW w:type="dxa" w:w="794"/>
-            <w:vAlign w:val="top"/>
-          </w:tcPr>
-          <w:p>
-            <w:r/>
-            <w:r>
-              <w:rPr>
-                <w:b/>
-                <w:sz w:val="20"/>
-              </w:rPr>
-              <w:t>V2-10</w:t>
-            </w:r>
-          </w:p>
-        </w:tc>
-        <w:tc>
-          <w:tcPr>
-            <w:tcW w:type="dxa" w:w="5386"/>
-            <w:vAlign w:val="top"/>
-          </w:tcPr>
-          <w:p>
-            <w:r/>
-            <w:r>
-              <w:rPr>
-                <w:sz w:val="20"/>
-              </w:rPr>
-              <w:t>Sistema de firmas digitales para aprobación de RAT (eIDAS o equivalente).</w:t>
-            </w:r>
-          </w:p>
-        </w:tc>
-        <w:tc>
-          <w:tcPr>
-            <w:tcW w:type="dxa" w:w="1020"/>
-            <w:vAlign w:val="top"/>
-          </w:tcPr>
-          <w:p>
-            <w:r/>
-            <w:r>
-              <w:rPr>
-                <w:sz w:val="20"/>
-              </w:rPr>
-              <w:t>Media</w:t>
-            </w:r>
-          </w:p>
-        </w:tc>
-        <w:tc>
-          <w:tcPr>
-            <w:tcW w:type="dxa" w:w="1020"/>
-            <w:vAlign w:val="top"/>
-          </w:tcPr>
-          <w:p>
-            <w:r/>
-            <w:r>
-              <w:rPr>
-                <w:sz w:val="20"/>
-              </w:rPr>
-              <w:t>13</w:t>
-            </w:r>
-          </w:p>
-        </w:tc>
-        <w:tc>
-          <w:tcPr>
-            <w:tcW w:type="dxa" w:w="1304"/>
-          </w:tcPr>
-          <w:p/>
-        </w:tc>
-      </w:tr>
-      <w:tr>
-        <w:tc>
-          <w:tcPr>
-            <w:tcW w:type="dxa" w:w="794"/>
-            <w:vAlign w:val="top"/>
-          </w:tcPr>
-          <w:p>
-            <w:r/>
-            <w:r>
-              <w:rPr>
-                <w:b/>
-                <w:sz w:val="20"/>
-              </w:rPr>
-              <w:t>V2-11</w:t>
-            </w:r>
-          </w:p>
-        </w:tc>
-        <w:tc>
-          <w:tcPr>
-            <w:tcW w:type="dxa" w:w="5386"/>
-            <w:vAlign w:val="top"/>
-          </w:tcPr>
-          <w:p>
-            <w:r/>
-            <w:r>
-              <w:rPr>
-                <w:sz w:val="20"/>
-              </w:rPr>
-              <w:t>Auditoría inmutable (blockchain privada o WORM storage).</w:t>
-            </w:r>
-          </w:p>
-        </w:tc>
-        <w:tc>
-          <w:tcPr>
-            <w:tcW w:type="dxa" w:w="1020"/>
-            <w:vAlign w:val="top"/>
-          </w:tcPr>
-          <w:p>
-            <w:r/>
-            <w:r>
-              <w:rPr>
-                <w:sz w:val="20"/>
-              </w:rPr>
-              <w:t>Baja</w:t>
-            </w:r>
-          </w:p>
-        </w:tc>
-        <w:tc>
-          <w:tcPr>
-            <w:tcW w:type="dxa" w:w="1020"/>
-            <w:vAlign w:val="top"/>
-          </w:tcPr>
-          <w:p>
-            <w:r/>
-            <w:r>
-              <w:rPr>
-                <w:sz w:val="20"/>
-              </w:rPr>
-              <w:t>13</w:t>
-            </w:r>
-          </w:p>
-        </w:tc>
-        <w:tc>
-          <w:tcPr>
-            <w:tcW w:type="dxa" w:w="1304"/>
-          </w:tcPr>
-          <w:p/>
-        </w:tc>
-      </w:tr>
-      <w:tr>
-        <w:tc>
-          <w:tcPr>
-            <w:tcW w:type="dxa" w:w="794"/>
-            <w:vAlign w:val="top"/>
-          </w:tcPr>
-          <w:p>
-            <w:r/>
-            <w:r>
-              <w:rPr>
-                <w:b/>
-                <w:sz w:val="20"/>
-              </w:rPr>
-              <w:t>V2-12</w:t>
-            </w:r>
-          </w:p>
-        </w:tc>
-        <w:tc>
-          <w:tcPr>
-            <w:tcW w:type="dxa" w:w="5386"/>
-            <w:vAlign w:val="top"/>
-          </w:tcPr>
-          <w:p>
-            <w:r/>
-            <w:r>
-              <w:rPr>
-                <w:sz w:val="20"/>
-              </w:rPr>
-              <w:t>Modo 'multipais' con soporte para LGPD, GDPR, CCPA.</w:t>
-            </w:r>
-          </w:p>
-        </w:tc>
-        <w:tc>
-          <w:tcPr>
-            <w:tcW w:type="dxa" w:w="1020"/>
-            <w:vAlign w:val="top"/>
-          </w:tcPr>
-          <w:p>
-            <w:r/>
-            <w:r>
-              <w:rPr>
-                <w:sz w:val="20"/>
-              </w:rPr>
-              <w:t>Baja</w:t>
-            </w:r>
-          </w:p>
-        </w:tc>
-        <w:tc>
-          <w:tcPr>
-            <w:tcW w:type="dxa" w:w="1020"/>
-            <w:vAlign w:val="top"/>
-          </w:tcPr>
-          <w:p>
-            <w:r/>
-            <w:r>
-              <w:rPr>
-                <w:sz w:val="20"/>
-              </w:rPr>
-              <w:t>21</w:t>
-            </w:r>
-          </w:p>
-        </w:tc>
-        <w:tc>
-          <w:tcPr>
-            <w:tcW w:type="dxa" w:w="1304"/>
-          </w:tcPr>
-          <w:p/>
-        </w:tc>
-      </w:tr>
-      <w:tr>
-        <w:tc>
-          <w:tcPr>
-            <w:tcW w:type="dxa" w:w="794"/>
-            <w:vAlign w:val="top"/>
-          </w:tcPr>
-          <w:p>
-            <w:r/>
-            <w:r>
-              <w:rPr>
-                <w:b/>
-                <w:sz w:val="20"/>
-              </w:rPr>
-              <w:t>V2-13</w:t>
-            </w:r>
-          </w:p>
-        </w:tc>
-        <w:tc>
-          <w:tcPr>
-            <w:tcW w:type="dxa" w:w="5386"/>
-            <w:vAlign w:val="top"/>
-          </w:tcPr>
-          <w:p>
-            <w:r/>
-            <w:r>
-              <w:rPr>
-                <w:sz w:val="20"/>
-              </w:rPr>
-              <w:t>Generador de EIPD automático con recomendaciones de la IA.</w:t>
-            </w:r>
-          </w:p>
-        </w:tc>
-        <w:tc>
-          <w:tcPr>
-            <w:tcW w:type="dxa" w:w="1020"/>
-            <w:vAlign w:val="top"/>
-          </w:tcPr>
-          <w:p>
-            <w:r/>
-            <w:r>
-              <w:rPr>
-                <w:sz w:val="20"/>
-              </w:rPr>
-              <w:t>Media</w:t>
-            </w:r>
-          </w:p>
-        </w:tc>
-        <w:tc>
-          <w:tcPr>
-            <w:tcW w:type="dxa" w:w="1020"/>
-            <w:vAlign w:val="top"/>
-          </w:tcPr>
-          <w:p>
-            <w:r/>
-            <w:r>
-              <w:rPr>
-                <w:sz w:val="20"/>
-              </w:rPr>
-              <w:t>8</w:t>
-            </w:r>
-          </w:p>
-        </w:tc>
-        <w:tc>
-          <w:tcPr>
-            <w:tcW w:type="dxa" w:w="1304"/>
-          </w:tcPr>
-          <w:p/>
-        </w:tc>
-      </w:tr>
-      <w:tr>
-        <w:tc>
-          <w:tcPr>
-            <w:tcW w:type="dxa" w:w="794"/>
-            <w:vAlign w:val="top"/>
-          </w:tcPr>
-          <w:p>
-            <w:r/>
-            <w:r>
-              <w:rPr>
-                <w:b/>
-                <w:sz w:val="20"/>
-              </w:rPr>
-              <w:t>V2-14</w:t>
-            </w:r>
-          </w:p>
-        </w:tc>
-        <w:tc>
-          <w:tcPr>
-            <w:tcW w:type="dxa" w:w="5386"/>
-            <w:vAlign w:val="top"/>
-          </w:tcPr>
-          <w:p>
-            <w:r/>
-            <w:r>
-              <w:rPr>
-                <w:sz w:val="20"/>
-              </w:rPr>
-              <w:t>Reportes avanzados: heatmap, mapas de calor de datos por zona geográfica.</w:t>
-            </w:r>
-          </w:p>
-        </w:tc>
-        <w:tc>
-          <w:tcPr>
-            <w:tcW w:type="dxa" w:w="1020"/>
-            <w:vAlign w:val="top"/>
-          </w:tcPr>
-          <w:p>
-            <w:r/>
-            <w:r>
-              <w:rPr>
-                <w:sz w:val="20"/>
-              </w:rPr>
-              <w:t>Baja</w:t>
-            </w:r>
-          </w:p>
-        </w:tc>
-        <w:tc>
-          <w:tcPr>
-            <w:tcW w:type="dxa" w:w="1020"/>
-            <w:vAlign w:val="top"/>
-          </w:tcPr>
-          <w:p>
-            <w:r/>
-            <w:r>
-              <w:rPr>
-                <w:sz w:val="20"/>
-              </w:rPr>
-              <w:t>13</w:t>
-            </w:r>
-          </w:p>
-        </w:tc>
-        <w:tc>
-          <w:tcPr>
-            <w:tcW w:type="dxa" w:w="1304"/>
-          </w:tcPr>
-          <w:p/>
         </w:tc>
       </w:tr>
     </w:tbl>
@@ -6134,7 +5464,7 @@
               <a:graphicData uri="http://schemas.openxmlformats.org/drawingml/2006/picture">
                 <pic:pic>
                   <pic:nvPicPr>
-                    <pic:cNvPr id="0" name="gantt_-3100487230012989664.png"/>
+                    <pic:cNvPr id="0" name="gantt_5924863525652841050.png"/>
                     <pic:cNvPicPr/>
                   </pic:nvPicPr>
                   <pic:blipFill>

</xml_diff>